<commit_message>
Sync script.md with slides_v2 (13-slide alignment)
script.md:
  + Added S3 dialogue (Price Fragmentation table, ~25s)
  + Added S5 dialogue (Baselines Fail chart, ~20s)
  + Split old Slide 7 Result into S9/S10/S11/S12 with separate dialogue
  + Added S10 dialogue (Profit Quality + compute time, ~20s)
  + Added S11 dialogue (Overnight 7200 runs, ~22s)
  + Added S12 dialogue (Quote Staleness 99.6%, ~16s)
  + Expanded S13 Close to absorb old Impact slide material
  + Updated timing table for 13 slides
  + Updated Visual Guide table with all 13 v2 slides

export_script_docx.py:
  - Rewrote as a proper markdown parser (reads script.md directly)
  - docx is now always in sync; re-run to regenerate after any script edit

script_for_review.docx:
  - Regenerated with all 13 slides, updated timing, updated Visual Guide

Co-authored-by: Cursor <cursoragent@cursor.com>
</commit_message>
<xml_diff>
--- a/docs/latex/StablecoinArbitrage_GSS2026/presentation/script_for_review.docx
+++ b/docs/latex/StablecoinArbitrage_GSS2026/presentation/script_for_review.docx
@@ -15,26 +15,39 @@
     </w:p>
     <w:p>
       <w:pPr>
+        <w:pStyle w:val="Heading1"/>
+      </w:pPr>
+      <w:r>
+        <w:rPr>
+          <w:color w:val="1A1A2E"/>
+        </w:rPr>
+        <w:t>Presentation Script — GSS 2026</w:t>
+      </w:r>
+    </w:p>
+    <w:p>
+      <w:pPr>
         <w:pStyle w:val="Heading2"/>
       </w:pPr>
       <w:r>
-        <w:t>"Execution-Aware A* Search for Cross-Exchange Stablecoin Arbitrage"</w:t>
+        <w:rPr>
+          <w:color w:val="1A1A2E"/>
+        </w:rPr>
+        <w:t>"Execution-Aware A Search for Cross-Exchange Stablecoin Arbitrage"</w:t>
       </w:r>
     </w:p>
     <w:p>
+      <w:pPr>
+        <w:pStyle w:val="Heading3"/>
+      </w:pPr>
       <w:r>
-        <w:rPr>
-          <w:b/>
-        </w:rPr>
         <w:t>Kevin Litvin · Canadian AI 2026 Graduate Student Symposium</w:t>
       </w:r>
     </w:p>
     <w:p>
+      <w:pPr>
+        <w:pStyle w:val="Heading3"/>
+      </w:pPr>
       <w:r>
-        <w:rPr>
-          <w:i/>
-          <w:color w:val="555555"/>
-        </w:rPr>
         <w:t>8 minutes presented + 4 minutes Q&amp;A</w:t>
       </w:r>
     </w:p>
@@ -48,212 +61,21 @@
     </w:p>
     <w:p>
       <w:pPr>
-        <w:pStyle w:val="Heading3"/>
+        <w:pBdr>
+          <w:bottom w:val="single" w:sz="4" w:space="1" w:color="CCCCCC"/>
+        </w:pBdr>
+        <w:spacing w:after="80"/>
+      </w:pPr>
+    </w:p>
+    <w:p>
+      <w:pPr>
+        <w:pStyle w:val="Heading2"/>
       </w:pPr>
       <w:r>
-        <w:t>How to Use This Document</w:t>
-      </w:r>
-    </w:p>
-    <w:tbl>
-      <w:tblPr>
-        <w:tblStyle w:val="TableGrid"/>
-        <w:tblW w:type="auto" w:w="0"/>
-        <w:tblLook w:firstColumn="1" w:firstRow="1" w:lastColumn="0" w:lastRow="0" w:noHBand="0" w:noVBand="1" w:val="04A0"/>
-      </w:tblPr>
-      <w:tblGrid>
-        <w:gridCol w:w="2592"/>
-        <w:gridCol w:w="6480"/>
-      </w:tblGrid>
-      <w:tr>
-        <w:tc>
-          <w:tcPr>
-            <w:tcW w:type="dxa" w:w="3816"/>
-            <w:shd w:val="clear" w:color="auto" w:fill="1A1A2E"/>
-          </w:tcPr>
-          <w:p>
-            <w:r>
-              <w:rPr>
-                <w:b/>
-                <w:color w:val="FFFFFF"/>
-              </w:rPr>
-              <w:t>Marker</w:t>
-            </w:r>
-          </w:p>
-        </w:tc>
-        <w:tc>
-          <w:tcPr>
-            <w:tcW w:type="dxa" w:w="3816"/>
-            <w:shd w:val="clear" w:color="auto" w:fill="1A1A2E"/>
-          </w:tcPr>
-          <w:p>
-            <w:r>
-              <w:rPr>
-                <w:b/>
-                <w:color w:val="FFFFFF"/>
-              </w:rPr>
-              <w:t>Meaning</w:t>
-            </w:r>
-          </w:p>
-        </w:tc>
-      </w:tr>
-      <w:tr>
-        <w:tc>
-          <w:tcPr>
-            <w:tcW w:type="dxa" w:w="3816"/>
-          </w:tcPr>
-          <w:p>
-            <w:r>
-              <w:rPr>
-                <w:b/>
-              </w:rPr>
-              <w:t>Italic text</w:t>
-            </w:r>
-          </w:p>
-        </w:tc>
-        <w:tc>
-          <w:tcPr>
-            <w:tcW w:type="dxa" w:w="3816"/>
-          </w:tcPr>
-          <w:p>
-            <w:r>
-              <w:t>= your spoken words — read or memorize them.</w:t>
-            </w:r>
-          </w:p>
-        </w:tc>
-      </w:tr>
-      <w:tr>
-        <w:tc>
-          <w:tcPr>
-            <w:tcW w:type="dxa" w:w="3816"/>
-          </w:tcPr>
-          <w:p>
-            <w:r>
-              <w:rPr>
-                <w:b/>
-              </w:rPr>
-              <w:t>[SLIDE: …]</w:t>
-            </w:r>
-          </w:p>
-        </w:tc>
-        <w:tc>
-          <w:tcPr>
-            <w:tcW w:type="dxa" w:w="3816"/>
-          </w:tcPr>
-          <w:p>
-            <w:r>
-              <w:t>= advance to or reference the named slide.</w:t>
-            </w:r>
-          </w:p>
-        </w:tc>
-      </w:tr>
-      <w:tr>
-        <w:tc>
-          <w:tcPr>
-            <w:tcW w:type="dxa" w:w="3816"/>
-          </w:tcPr>
-          <w:p>
-            <w:r>
-              <w:rPr>
-                <w:b/>
-              </w:rPr>
-              <w:t>[PAUSE]</w:t>
-            </w:r>
-          </w:p>
-        </w:tc>
-        <w:tc>
-          <w:tcPr>
-            <w:tcW w:type="dxa" w:w="3816"/>
-          </w:tcPr>
-          <w:p>
-            <w:r>
-              <w:t>= stop speaking for 1–2 full seconds. Do not fill it.</w:t>
-            </w:r>
-          </w:p>
-        </w:tc>
-      </w:tr>
-      <w:tr>
-        <w:tc>
-          <w:tcPr>
-            <w:tcW w:type="dxa" w:w="3816"/>
-          </w:tcPr>
-          <w:p>
-            <w:r>
-              <w:rPr>
-                <w:b/>
-              </w:rPr>
-              <w:t>[BEAT]</w:t>
-            </w:r>
-          </w:p>
-        </w:tc>
-        <w:tc>
-          <w:tcPr>
-            <w:tcW w:type="dxa" w:w="3816"/>
-          </w:tcPr>
-          <w:p>
-            <w:r>
-              <w:t>= half-second breath before continuing.</w:t>
-            </w:r>
-          </w:p>
-        </w:tc>
-      </w:tr>
-      <w:tr>
-        <w:tc>
-          <w:tcPr>
-            <w:tcW w:type="dxa" w:w="3816"/>
-          </w:tcPr>
-          <w:p>
-            <w:r>
-              <w:rPr>
-                <w:b/>
-              </w:rPr>
-              <w:t>[DIRECTION: …]</w:t>
-            </w:r>
-          </w:p>
-        </w:tc>
-        <w:tc>
-          <w:tcPr>
-            <w:tcW w:type="dxa" w:w="3816"/>
-          </w:tcPr>
-          <w:p>
-            <w:r>
-              <w:t>= physical or delivery cue — not spoken.</w:t>
-            </w:r>
-          </w:p>
-        </w:tc>
-      </w:tr>
-      <w:tr>
-        <w:tc>
-          <w:tcPr>
-            <w:tcW w:type="dxa" w:w="3816"/>
-          </w:tcPr>
-          <w:p>
-            <w:r>
-              <w:rPr>
-                <w:b/>
-              </w:rPr>
-              <w:t>Target pace</w:t>
-            </w:r>
-          </w:p>
-        </w:tc>
-        <w:tc>
-          <w:tcPr>
-            <w:tcW w:type="dxa" w:w="3816"/>
-          </w:tcPr>
-          <w:p>
-            <w:r>
-              <w:t>~125 words per minute. Total spoken words: ~940.</w:t>
-            </w:r>
-          </w:p>
-        </w:tc>
-      </w:tr>
-    </w:tbl>
-    <w:p/>
-    <w:p>
-      <w:pPr>
-        <w:pStyle w:val="Heading3"/>
-      </w:pPr>
-      <w:r>
-        <w:t>Judging Criteria</w:t>
+        <w:rPr>
+          <w:color w:val="1A1A2E"/>
+        </w:rPr>
+        <w:t>Judging Criteria (internalize these — judges score on all six)</w:t>
       </w:r>
     </w:p>
     <w:tbl>
@@ -269,7 +91,7 @@
       <w:tr>
         <w:tc>
           <w:tcPr>
-            <w:tcW w:type="dxa" w:w="6480"/>
+            <w:tcW w:type="dxa" w:w="5904"/>
             <w:shd w:val="clear" w:color="auto" w:fill="CC0633"/>
           </w:tcPr>
           <w:p>
@@ -285,7 +107,7 @@
         </w:tc>
         <w:tc>
           <w:tcPr>
-            <w:tcW w:type="dxa" w:w="1440"/>
+            <w:tcW w:type="dxa" w:w="5904"/>
             <w:shd w:val="clear" w:color="auto" w:fill="CC0633"/>
           </w:tcPr>
           <w:p>
@@ -303,7 +125,7 @@
       <w:tr>
         <w:tc>
           <w:tcPr>
-            <w:tcW w:type="dxa" w:w="6480"/>
+            <w:tcW w:type="dxa" w:w="5904"/>
             <w:shd w:val="clear" w:color="auto" w:fill="F2F2F7"/>
           </w:tcPr>
           <w:p>
@@ -317,7 +139,7 @@
         </w:tc>
         <w:tc>
           <w:tcPr>
-            <w:tcW w:type="dxa" w:w="1440"/>
+            <w:tcW w:type="dxa" w:w="5904"/>
             <w:shd w:val="clear" w:color="auto" w:fill="F2F2F7"/>
           </w:tcPr>
           <w:p>
@@ -333,7 +155,7 @@
       <w:tr>
         <w:tc>
           <w:tcPr>
-            <w:tcW w:type="dxa" w:w="6480"/>
+            <w:tcW w:type="dxa" w:w="5904"/>
             <w:shd w:val="clear" w:color="auto" w:fill="FFFFFF"/>
           </w:tcPr>
           <w:p>
@@ -347,7 +169,7 @@
         </w:tc>
         <w:tc>
           <w:tcPr>
-            <w:tcW w:type="dxa" w:w="1440"/>
+            <w:tcW w:type="dxa" w:w="5904"/>
             <w:shd w:val="clear" w:color="auto" w:fill="FFFFFF"/>
           </w:tcPr>
           <w:p>
@@ -363,7 +185,7 @@
       <w:tr>
         <w:tc>
           <w:tcPr>
-            <w:tcW w:type="dxa" w:w="6480"/>
+            <w:tcW w:type="dxa" w:w="5904"/>
             <w:shd w:val="clear" w:color="auto" w:fill="F2F2F7"/>
           </w:tcPr>
           <w:p>
@@ -377,7 +199,7 @@
         </w:tc>
         <w:tc>
           <w:tcPr>
-            <w:tcW w:type="dxa" w:w="1440"/>
+            <w:tcW w:type="dxa" w:w="5904"/>
             <w:shd w:val="clear" w:color="auto" w:fill="F2F2F7"/>
           </w:tcPr>
           <w:p>
@@ -393,7 +215,7 @@
       <w:tr>
         <w:tc>
           <w:tcPr>
-            <w:tcW w:type="dxa" w:w="6480"/>
+            <w:tcW w:type="dxa" w:w="5904"/>
             <w:shd w:val="clear" w:color="auto" w:fill="FFFFFF"/>
           </w:tcPr>
           <w:p>
@@ -407,7 +229,7 @@
         </w:tc>
         <w:tc>
           <w:tcPr>
-            <w:tcW w:type="dxa" w:w="1440"/>
+            <w:tcW w:type="dxa" w:w="5904"/>
             <w:shd w:val="clear" w:color="auto" w:fill="FFFFFF"/>
           </w:tcPr>
           <w:p>
@@ -423,7 +245,7 @@
       <w:tr>
         <w:tc>
           <w:tcPr>
-            <w:tcW w:type="dxa" w:w="6480"/>
+            <w:tcW w:type="dxa" w:w="5904"/>
             <w:shd w:val="clear" w:color="auto" w:fill="F2F2F7"/>
           </w:tcPr>
           <w:p>
@@ -437,7 +259,7 @@
         </w:tc>
         <w:tc>
           <w:tcPr>
-            <w:tcW w:type="dxa" w:w="1440"/>
+            <w:tcW w:type="dxa" w:w="5904"/>
             <w:shd w:val="clear" w:color="auto" w:fill="F2F2F7"/>
           </w:tcPr>
           <w:p>
@@ -453,7 +275,7 @@
       <w:tr>
         <w:tc>
           <w:tcPr>
-            <w:tcW w:type="dxa" w:w="6480"/>
+            <w:tcW w:type="dxa" w:w="5904"/>
             <w:shd w:val="clear" w:color="auto" w:fill="FFFFFF"/>
           </w:tcPr>
           <w:p>
@@ -467,7 +289,7 @@
         </w:tc>
         <w:tc>
           <w:tcPr>
-            <w:tcW w:type="dxa" w:w="1440"/>
+            <w:tcW w:type="dxa" w:w="5904"/>
             <w:shd w:val="clear" w:color="auto" w:fill="FFFFFF"/>
           </w:tcPr>
           <w:p>
@@ -492,154 +314,21 @@
     </w:p>
     <w:p>
       <w:pPr>
-        <w:pStyle w:val="SlideHeader"/>
         <w:pBdr>
-          <w:left w:val="single" w:sz="24" w:space="6" w:color="CC0633"/>
+          <w:bottom w:val="single" w:sz="4" w:space="1" w:color="CCCCCC"/>
         </w:pBdr>
+        <w:spacing w:after="80"/>
       </w:pPr>
-      <w:r>
-        <w:t>SLIDE 1 · Title · 0:00 – 0:55</w:t>
-      </w:r>
     </w:p>
     <w:p>
       <w:pPr>
-        <w:spacing w:after="80"/>
-        <w:ind w:left="432"/>
-        <w:shd w:val="clear" w:color="auto" w:fill="E8EAF6"/>
+        <w:pStyle w:val="Heading2"/>
       </w:pPr>
       <w:r>
         <w:rPr>
-          <w:rFonts w:ascii="Courier New" w:hAnsi="Courier New"/>
-          <w:color w:val="444444"/>
-          <w:sz w:val="18"/>
-        </w:rPr>
-        <w:t>[SLIDE: Title slide — your name, paper title, GSS 2026 logo, FullGraph.png as full-bleed background image]</w:t>
-      </w:r>
-    </w:p>
-    <w:p>
-      <w:pPr>
-        <w:pStyle w:val="Visual"/>
-        <w:pBdr>
-          <w:left w:val="single" w:sz="12" w:space="6" w:color="FF9800"/>
-        </w:pBdr>
-        <w:shd w:val="clear" w:color="auto" w:fill="FFF8E1"/>
-      </w:pPr>
-      <w:r>
-        <w:rPr>
-          <w:b/>
-          <w:color w:val="E65100"/>
-        </w:rPr>
-        <w:t xml:space="preserve">▶ Visual: </w:t>
-      </w:r>
-      <w:r>
-        <w:rPr>
-          <w:color w:val="6D4000"/>
-        </w:rPr>
-        <w:t>Use FullGraph.png as the slide background at low opacity. The audience sees a dense, beautiful network before you speak. Immediate curiosity — 'what is that?' — before a single word.</w:t>
-      </w:r>
-    </w:p>
-    <w:p/>
-    <w:p>
-      <w:pPr>
-        <w:pStyle w:val="Direction"/>
-      </w:pPr>
-      <w:r>
-        <w:rPr>
-          <w:color w:val="555555"/>
-        </w:rPr>
-        <w:t>[DIRECTION: Walk to centre. Make eye contact with three different people. Let two full seconds of silence pass. Do not start talking immediately.]</w:t>
-      </w:r>
-    </w:p>
-    <w:p>
-      <w:pPr>
-        <w:pStyle w:val="Spoken"/>
-      </w:pPr>
-      <w:r>
-        <w:rPr>
-          <w:i/>
           <w:color w:val="1A1A2E"/>
         </w:rPr>
-        <w:t>"Before I start — quick show of hands."</w:t>
-      </w:r>
-    </w:p>
-    <w:p>
-      <w:pPr>
-        <w:pStyle w:val="Direction"/>
-      </w:pPr>
-      <w:r>
-        <w:rPr>
-          <w:color w:val="555555"/>
-        </w:rPr>
-        <w:t>[DIRECTION: Raise your own hand as you ask.]</w:t>
-      </w:r>
-    </w:p>
-    <w:p>
-      <w:pPr>
-        <w:pStyle w:val="Spoken"/>
-      </w:pPr>
-      <w:r>
-        <w:rPr>
-          <w:i/>
-          <w:color w:val="1A1A2E"/>
-        </w:rPr>
-        <w:t>"How many of you have ever sent money internationally — transferred between banks, used Wise, PayPal, anything like that?"</w:t>
-      </w:r>
-    </w:p>
-    <w:p>
-      <w:pPr>
-        <w:pStyle w:val="Pause"/>
-      </w:pPr>
-      <w:r>
-        <w:rPr>
-          <w:color w:val="2277CC"/>
-        </w:rPr>
-        <w:t>[PAUSE — scan the room, nod.]</w:t>
-      </w:r>
-    </w:p>
-    <w:p>
-      <w:pPr>
-        <w:pStyle w:val="Spoken"/>
-      </w:pPr>
-      <w:r>
-        <w:rPr>
-          <w:i/>
-          <w:color w:val="1A1A2E"/>
-        </w:rPr>
-        <w:t>"Every one of those transfers was routed through a system trying to find the cheapest, fastest path through a global financial network."</w:t>
-      </w:r>
-    </w:p>
-    <w:p>
-      <w:pPr>
-        <w:pStyle w:val="Pause"/>
-      </w:pPr>
-      <w:r>
-        <w:rPr>
-          <w:color w:val="2277CC"/>
-        </w:rPr>
-        <w:t>[BEAT]</w:t>
-      </w:r>
-    </w:p>
-    <w:p>
-      <w:pPr>
-        <w:pStyle w:val="Spoken"/>
-      </w:pPr>
-      <w:r>
-        <w:rPr>
-          <w:i/>
-          <w:color w:val="1A1A2E"/>
-        </w:rPr>
-        <w:t>"What I'm going to show you today is essentially Google Maps... for thirty-three trillion dollars."</w:t>
-      </w:r>
-    </w:p>
-    <w:p>
-      <w:pPr>
-        <w:pStyle w:val="Direction"/>
-      </w:pPr>
-      <w:r>
-        <w:rPr>
-          <w:color w:val="555555"/>
-        </w:rPr>
-        <w:t>[DIRECTION: Let that number land. Do not continue immediately. Hold eye contact.]</w:t>
+        <w:t>SLIDE 1 · Title · 0:00 – 0:50</w:t>
       </w:r>
     </w:p>
     <w:p>
@@ -652,156 +341,13 @@
     </w:p>
     <w:p>
       <w:pPr>
-        <w:pStyle w:val="SlideHeader"/>
-        <w:pBdr>
-          <w:left w:val="single" w:sz="24" w:space="6" w:color="CC0633"/>
-        </w:pBdr>
-      </w:pPr>
-      <w:r>
-        <w:t>SLIDE 2 · The Market · 0:55 – 1:45</w:t>
-      </w:r>
-    </w:p>
-    <w:p>
-      <w:pPr>
-        <w:spacing w:after="80"/>
-        <w:ind w:left="432"/>
-        <w:shd w:val="clear" w:color="auto" w:fill="E8EAF6"/>
+        <w:pStyle w:val="Heading2"/>
       </w:pPr>
       <w:r>
         <w:rPr>
-          <w:rFonts w:ascii="Courier New" w:hAnsi="Courier New"/>
-          <w:color w:val="444444"/>
-          <w:sz w:val="18"/>
-        </w:rPr>
-        <w:t>[SLIDE: Bar chart — Mastercard $8T | Visa $15T | Stablecoins $33T (animated, reveal one bar at a time). USDT and USDC logos beside the stablecoin bar.]</w:t>
-      </w:r>
-    </w:p>
-    <w:p>
-      <w:pPr>
-        <w:pStyle w:val="Visual"/>
-        <w:pBdr>
-          <w:left w:val="single" w:sz="12" w:space="6" w:color="FF9800"/>
-        </w:pBdr>
-        <w:shd w:val="clear" w:color="auto" w:fill="FFF8E1"/>
-      </w:pPr>
-      <w:r>
-        <w:rPr>
-          <w:b/>
-          <w:color w:val="E65100"/>
-        </w:rPr>
-        <w:t xml:space="preserve">▶ Visual: </w:t>
-      </w:r>
-      <w:r>
-        <w:rPr>
-          <w:color w:val="6D4000"/>
-        </w:rPr>
-        <w:t>The bars should animate in one at a time, left to right, on click. The stablecoin bar should be noticeably taller — the contrast is the whole point.</w:t>
-      </w:r>
-    </w:p>
-    <w:p/>
-    <w:p>
-      <w:pPr>
-        <w:pStyle w:val="Spoken"/>
-      </w:pPr>
-      <w:r>
-        <w:rPr>
-          <w:i/>
           <w:color w:val="1A1A2E"/>
         </w:rPr>
-        <w:t>"Stablecoins — USDT, USDC, DAI. Digital dollars. Cryptocurrencies pegged one-to-one with fiat, sitting at the intersection of traditional finance and the crypto world."</w:t>
-      </w:r>
-    </w:p>
-    <w:p>
-      <w:pPr>
-        <w:pStyle w:val="Spoken"/>
-      </w:pPr>
-      <w:r>
-        <w:rPr>
-          <w:i/>
-          <w:color w:val="1A1A2E"/>
-        </w:rPr>
-        <w:t>"Last year, stablecoins processed thirty-three trillion dollars in transaction volume."</w:t>
-      </w:r>
-    </w:p>
-    <w:p>
-      <w:pPr>
-        <w:pStyle w:val="Pause"/>
-      </w:pPr>
-      <w:r>
-        <w:rPr>
-          <w:color w:val="2277CC"/>
-        </w:rPr>
-        <w:t>[PAUSE]</w:t>
-      </w:r>
-    </w:p>
-    <w:p>
-      <w:pPr>
-        <w:pStyle w:val="Spoken"/>
-      </w:pPr>
-      <w:r>
-        <w:rPr>
-          <w:i/>
-          <w:color w:val="1A1A2E"/>
-        </w:rPr>
-        <w:t>"More than Visa. More than Mastercard. Combined."</w:t>
-      </w:r>
-    </w:p>
-    <w:p>
-      <w:pPr>
-        <w:pStyle w:val="Pause"/>
-      </w:pPr>
-      <w:r>
-        <w:rPr>
-          <w:color w:val="2277CC"/>
-        </w:rPr>
-        <w:t>[BEAT]</w:t>
-      </w:r>
-    </w:p>
-    <w:p>
-      <w:pPr>
-        <w:pStyle w:val="Spoken"/>
-      </w:pPr>
-      <w:r>
-        <w:rPr>
-          <w:i/>
-          <w:color w:val="1A1A2E"/>
-        </w:rPr>
-        <w:t>"Three hundred billion dollars in market capitalization. They are the liquidity highways of the entire crypto ecosystem — the bridge every trader crosses when moving capital between assets, exchanges, or borders."</w:t>
-      </w:r>
-    </w:p>
-    <w:p>
-      <w:pPr>
-        <w:pStyle w:val="Spoken"/>
-      </w:pPr>
-      <w:r>
-        <w:rPr>
-          <w:i/>
-          <w:color w:val="1A1A2E"/>
-        </w:rPr>
-        <w:t>"So here is the question this research asks: those highways are fragmented across twelve independent exchanges, each pricing the same assets slightly differently at the same instant. Can we build a system smart enough to find and execute a profitable path through that fragmentation — accounting for every real-world cost?"</w:t>
-      </w:r>
-    </w:p>
-    <w:p>
-      <w:pPr>
-        <w:pStyle w:val="Pause"/>
-      </w:pPr>
-      <w:r>
-        <w:rPr>
-          <w:color w:val="2277CC"/>
-        </w:rPr>
-        <w:t>[BEAT]</w:t>
-      </w:r>
-    </w:p>
-    <w:p>
-      <w:pPr>
-        <w:pStyle w:val="Spoken"/>
-      </w:pPr>
-      <w:r>
-        <w:rPr>
-          <w:i/>
-          <w:color w:val="1A1A2E"/>
-        </w:rPr>
-        <w:t>"That is what we set out to answer."</w:t>
+        <w:t>SLIDE 2 · The Market · 0:50 – 1:35</w:t>
       </w:r>
     </w:p>
     <w:p>
@@ -814,214 +360,13 @@
     </w:p>
     <w:p>
       <w:pPr>
-        <w:pStyle w:val="SlideHeader"/>
-        <w:pBdr>
-          <w:left w:val="single" w:sz="24" w:space="6" w:color="CC0633"/>
-        </w:pBdr>
-      </w:pPr>
-      <w:r>
-        <w:t>SLIDE 3 · The Problem · 1:45 – 2:55</w:t>
-      </w:r>
-    </w:p>
-    <w:p>
-      <w:pPr>
-        <w:spacing w:after="80"/>
-        <w:ind w:left="432"/>
-        <w:shd w:val="clear" w:color="auto" w:fill="E8EAF6"/>
+        <w:pStyle w:val="Heading2"/>
       </w:pPr>
       <w:r>
         <w:rPr>
-          <w:rFonts w:ascii="Courier New" w:hAnsi="Courier New"/>
-          <w:color w:val="444444"/>
-          <w:sz w:val="18"/>
-        </w:rPr>
-        <w:t>[SLIDE: Split image — LEFT: clean A→B profitable cycle. RIGHT: same path with four red warning icons appearing one at a time: a fee tag, a price impact curve, a clock, an exchange suspension warning.]</w:t>
-      </w:r>
-    </w:p>
-    <w:p>
-      <w:pPr>
-        <w:pStyle w:val="Visual"/>
-        <w:pBdr>
-          <w:left w:val="single" w:sz="12" w:space="6" w:color="FF9800"/>
-        </w:pBdr>
-        <w:shd w:val="clear" w:color="auto" w:fill="FFF8E1"/>
-      </w:pPr>
-      <w:r>
-        <w:rPr>
-          <w:b/>
-          <w:color w:val="E65100"/>
-        </w:rPr>
-        <w:t xml:space="preserve">▶ Visual: </w:t>
-      </w:r>
-      <w:r>
-        <w:rPr>
-          <w:color w:val="6D4000"/>
-        </w:rPr>
-        <w:t>The left half shows what existing systems see — a clean arbitrage cycle. The right half reveals the execution reality. Animate the four icons on click, synchronized with the four spoken challenges.</w:t>
-      </w:r>
-    </w:p>
-    <w:p/>
-    <w:p>
-      <w:pPr>
-        <w:pStyle w:val="Direction"/>
-      </w:pPr>
-      <w:r>
-        <w:rPr>
-          <w:color w:val="555555"/>
-        </w:rPr>
-        <w:t>[DIRECTION: Step slightly forward. This is where tension builds.]</w:t>
-      </w:r>
-    </w:p>
-    <w:p>
-      <w:pPr>
-        <w:pStyle w:val="Spoken"/>
-      </w:pPr>
-      <w:r>
-        <w:rPr>
-          <w:i/>
           <w:color w:val="1A1A2E"/>
         </w:rPr>
-        <w:t>"Imagine you are a quant trader. It is two in the morning. You are watching prices across twelve different exchanges and you see it — USDT is trading fractionally cheaper on Kraken than it is selling for on KuCoin. The gap is real. The math works."</w:t>
-      </w:r>
-    </w:p>
-    <w:p>
-      <w:pPr>
-        <w:pStyle w:val="Spoken"/>
-      </w:pPr>
-      <w:r>
-        <w:rPr>
-          <w:i/>
-          <w:color w:val="1A1A2E"/>
-        </w:rPr>
-        <w:t>"Existing systems would tell you: there is an arbitrage opportunity here. Take it."</w:t>
-      </w:r>
-    </w:p>
-    <w:p>
-      <w:pPr>
-        <w:pStyle w:val="Pause"/>
-      </w:pPr>
-      <w:r>
-        <w:rPr>
-          <w:color w:val="2277CC"/>
-        </w:rPr>
-        <w:t>[BEAT]</w:t>
-      </w:r>
-    </w:p>
-    <w:p>
-      <w:pPr>
-        <w:pStyle w:val="Spoken"/>
-      </w:pPr>
-      <w:r>
-        <w:rPr>
-          <w:i/>
-          <w:color w:val="1A1A2E"/>
-        </w:rPr>
-        <w:t>"But here is what those systems do not tell you."</w:t>
-      </w:r>
-    </w:p>
-    <w:p>
-      <w:pPr>
-        <w:pStyle w:val="Direction"/>
-      </w:pPr>
-      <w:r>
-        <w:rPr>
-          <w:color w:val="555555"/>
-        </w:rPr>
-        <w:t>[DIRECTION: Count on fingers — slow, deliberate, one beat after each.]</w:t>
-      </w:r>
-    </w:p>
-    <w:p>
-      <w:pPr>
-        <w:pStyle w:val="Spoken"/>
-      </w:pPr>
-      <w:r>
-        <w:rPr>
-          <w:i/>
-          <w:color w:val="1A1A2E"/>
-        </w:rPr>
-        <w:t>"First — the taker fee at each exchange eats into your margin."</w:t>
-      </w:r>
-    </w:p>
-    <w:p>
-      <w:pPr>
-        <w:pStyle w:val="Spoken"/>
-      </w:pPr>
-      <w:r>
-        <w:rPr>
-          <w:i/>
-          <w:color w:val="1A1A2E"/>
-        </w:rPr>
-        <w:t>"Second — your order size is large enough that buying on Kraken moves the price against you before your fill is complete. That is called slippage. Dynamic, live, and invisible to static models."</w:t>
-      </w:r>
-    </w:p>
-    <w:p>
-      <w:pPr>
-        <w:pStyle w:val="Spoken"/>
-      </w:pPr>
-      <w:r>
-        <w:rPr>
-          <w:i/>
-          <w:color w:val="1A1A2E"/>
-        </w:rPr>
-        <w:t>"Third — the blockchain transfer between exchanges takes time. The window may close while you are waiting for confirmations."</w:t>
-      </w:r>
-    </w:p>
-    <w:p>
-      <w:pPr>
-        <w:pStyle w:val="Spoken"/>
-      </w:pPr>
-      <w:r>
-        <w:rPr>
-          <w:i/>
-          <w:color w:val="1A1A2E"/>
-        </w:rPr>
-        <w:t>"Fourth — an exchange might suspend withdrawals entirely. We have seen this happen overnight, without warning."</w:t>
-      </w:r>
-    </w:p>
-    <w:p>
-      <w:pPr>
-        <w:pStyle w:val="Pause"/>
-      </w:pPr>
-      <w:r>
-        <w:rPr>
-          <w:color w:val="2277CC"/>
-        </w:rPr>
-        <w:t>[PAUSE]</w:t>
-      </w:r>
-    </w:p>
-    <w:p>
-      <w:pPr>
-        <w:pStyle w:val="Spoken"/>
-      </w:pPr>
-      <w:r>
-        <w:rPr>
-          <w:i/>
-          <w:color w:val="1A1A2E"/>
-        </w:rPr>
-        <w:t>"Liquidity. Slippage. Latency. Reliability."</w:t>
-      </w:r>
-    </w:p>
-    <w:p>
-      <w:pPr>
-        <w:pStyle w:val="Pause"/>
-      </w:pPr>
-      <w:r>
-        <w:rPr>
-          <w:color w:val="2277CC"/>
-        </w:rPr>
-        <w:t>[BEAT]</w:t>
-      </w:r>
-    </w:p>
-    <w:p>
-      <w:pPr>
-        <w:pStyle w:val="Spoken"/>
-      </w:pPr>
-      <w:r>
-        <w:rPr>
-          <w:i/>
-          <w:color w:val="1A1A2E"/>
-        </w:rPr>
-        <w:t>"Bellman-Ford finds the cycle. One-hop and two-hop enumeration find the cycle. In our experiments, all three baselines fail entirely — they cannot identify a profitable executable path under these conditions. We needed something different."</w:t>
+        <w:t>SLIDE 3 · Price Fragmentation · 1:35 – 2:00</w:t>
       </w:r>
     </w:p>
     <w:p>
@@ -1034,121 +379,13 @@
     </w:p>
     <w:p>
       <w:pPr>
-        <w:pStyle w:val="SlideHeader"/>
-        <w:pBdr>
-          <w:left w:val="single" w:sz="24" w:space="6" w:color="CC0633"/>
-        </w:pBdr>
-      </w:pPr>
-      <w:r>
-        <w:t>SLIDE 4 · The Graph · 2:55 – 3:40</w:t>
-      </w:r>
-    </w:p>
-    <w:p>
-      <w:pPr>
-        <w:spacing w:after="80"/>
-        <w:ind w:left="432"/>
-        <w:shd w:val="clear" w:color="auto" w:fill="E8EAF6"/>
+        <w:pStyle w:val="Heading2"/>
       </w:pPr>
       <w:r>
         <w:rPr>
-          <w:rFonts w:ascii="Courier New" w:hAnsi="Courier New"/>
-          <w:color w:val="444444"/>
-          <w:sz w:val="18"/>
-        </w:rPr>
-        <w:t>[SLIDE: FullGraph.png — full slide, clean, with one highlighted path glowing through it. Label: '12 exchanges · 41 nodes · 864 edges · Live market data']</w:t>
-      </w:r>
-    </w:p>
-    <w:p>
-      <w:pPr>
-        <w:pStyle w:val="Visual"/>
-        <w:pBdr>
-          <w:left w:val="single" w:sz="12" w:space="6" w:color="FF9800"/>
-        </w:pBdr>
-        <w:shd w:val="clear" w:color="auto" w:fill="FFF8E1"/>
-      </w:pPr>
-      <w:r>
-        <w:rPr>
-          <w:b/>
-          <w:color w:val="E65100"/>
-        </w:rPr>
-        <w:t xml:space="preserve">▶ Visual: </w:t>
-      </w:r>
-      <w:r>
-        <w:rPr>
-          <w:color w:val="6D4000"/>
-        </w:rPr>
-        <w:t>Use the actual FullGraph.png image from the paper at full resolution. Overlay a single coloured path through the graph. The four label terms appear as small annotations.</w:t>
-      </w:r>
-    </w:p>
-    <w:p/>
-    <w:p>
-      <w:pPr>
-        <w:pStyle w:val="Direction"/>
-      </w:pPr>
-      <w:r>
-        <w:rPr>
-          <w:color w:val="555555"/>
-        </w:rPr>
-        <w:t>[DIRECTION: Gesture toward the slide. Let the image carry the weight here.]</w:t>
-      </w:r>
-    </w:p>
-    <w:p>
-      <w:pPr>
-        <w:pStyle w:val="Spoken"/>
-      </w:pPr>
-      <w:r>
-        <w:rPr>
-          <w:i/>
           <w:color w:val="1A1A2E"/>
         </w:rPr>
-        <w:t>"This is our dataset. The actual network we built."</w:t>
-      </w:r>
-    </w:p>
-    <w:p>
-      <w:pPr>
-        <w:pStyle w:val="Spoken"/>
-      </w:pPr>
-      <w:r>
-        <w:rPr>
-          <w:i/>
-          <w:color w:val="1A1A2E"/>
-        </w:rPr>
-        <w:t>"Every dot is a trading pair on one of twelve exchanges. Every line is a possible trade or cross-exchange transfer — and it carries the complete real-world cost of that action: the taker fee, the live slippage estimate from the order book, the gas cost, and the venue's reliability score."</w:t>
-      </w:r>
-    </w:p>
-    <w:p>
-      <w:pPr>
-        <w:pStyle w:val="Spoken"/>
-      </w:pPr>
-      <w:r>
-        <w:rPr>
-          <w:i/>
-          <w:color w:val="1A1A2E"/>
-        </w:rPr>
-        <w:t>"To our knowledge, this is the first execution-aware graph dataset built specifically for stablecoin arbitrage research."</w:t>
-      </w:r>
-    </w:p>
-    <w:p>
-      <w:pPr>
-        <w:pStyle w:val="Pause"/>
-      </w:pPr>
-      <w:r>
-        <w:rPr>
-          <w:color w:val="2277CC"/>
-        </w:rPr>
-        <w:t>[PAUSE]</w:t>
-      </w:r>
-    </w:p>
-    <w:p>
-      <w:pPr>
-        <w:pStyle w:val="Spoken"/>
-      </w:pPr>
-      <w:r>
-        <w:rPr>
-          <w:i/>
-          <w:color w:val="1A1A2E"/>
-        </w:rPr>
-        <w:t>"The question is: which path through this network, starting from any node, ends with more dollars than you started with — and can actually be executed?"</w:t>
+        <w:t>SLIDE 4 · Execution Barriers · 2:00 – 2:50</w:t>
       </w:r>
     </w:p>
     <w:p>
@@ -1161,99 +398,13 @@
     </w:p>
     <w:p>
       <w:pPr>
-        <w:pStyle w:val="SlideHeader"/>
-        <w:pBdr>
-          <w:left w:val="single" w:sz="24" w:space="6" w:color="CC0633"/>
-        </w:pBdr>
-      </w:pPr>
-      <w:r>
-        <w:t>SLIDE 5 · A* Search · 3:40 – 4:30</w:t>
-      </w:r>
-    </w:p>
-    <w:p>
-      <w:pPr>
-        <w:spacing w:after="80"/>
-        <w:ind w:left="432"/>
-        <w:shd w:val="clear" w:color="auto" w:fill="E8EAF6"/>
+        <w:pStyle w:val="Heading2"/>
       </w:pPr>
       <w:r>
         <w:rPr>
-          <w:rFonts w:ascii="Courier New" w:hAnsi="Courier New"/>
-          <w:color w:val="444444"/>
-          <w:sz w:val="18"/>
-        </w:rPr>
-        <w:t>[SLIDE: Side-by-side animation. LEFT: 'Dijkstra' — nodes light up in a broad expanding wave. RIGHT: 'A* with h₂' — a narrow directed beam. Node expansion counter under each. Right counter stops at ~70% of the left.]</w:t>
-      </w:r>
-    </w:p>
-    <w:p>
-      <w:pPr>
-        <w:pStyle w:val="Visual"/>
-        <w:pBdr>
-          <w:left w:val="single" w:sz="12" w:space="6" w:color="FF9800"/>
-        </w:pBdr>
-        <w:shd w:val="clear" w:color="auto" w:fill="FFF8E1"/>
-      </w:pPr>
-      <w:r>
-        <w:rPr>
-          <w:b/>
-          <w:color w:val="E65100"/>
-        </w:rPr>
-        <w:t xml:space="preserve">▶ Visual: </w:t>
-      </w:r>
-      <w:r>
-        <w:rPr>
-          <w:color w:val="6D4000"/>
-        </w:rPr>
-        <w:t>This is the single most important visual in the deck. The 29% reduction must be SEEN before it is said. Animate on click: both panels expand simultaneously.</w:t>
-      </w:r>
-    </w:p>
-    <w:p/>
-    <w:p>
-      <w:pPr>
-        <w:pStyle w:val="Spoken"/>
-      </w:pPr>
-      <w:r>
-        <w:rPr>
-          <w:i/>
           <w:color w:val="1A1A2E"/>
         </w:rPr>
-        <w:t>"Our core algorithm is A* search — the same search strategy that powers GPS navigation and game AI. The key insight: instead of exploring every possible path, A* uses an evaluation function, f of n equals g of n plus h of n, to decide which node to expand next."</w:t>
-      </w:r>
-    </w:p>
-    <w:p>
-      <w:pPr>
-        <w:pStyle w:val="Spoken"/>
-      </w:pPr>
-      <w:r>
-        <w:rPr>
-          <w:i/>
-          <w:color w:val="1A1A2E"/>
-        </w:rPr>
-        <w:t>"g of n is the cost of the path so far. h of n is our heuristic — a domain-specific estimate of the execution risk ahead. Together they steer the search toward paths that are not just short, but feasible."</w:t>
-      </w:r>
-    </w:p>
-    <w:p>
-      <w:pPr>
-        <w:pStyle w:val="Spoken"/>
-      </w:pPr>
-      <w:r>
-        <w:rPr>
-          <w:i/>
-          <w:color w:val="1A1A2E"/>
-        </w:rPr>
-        <w:t>"Think of it like Google Maps during rush hour. It does not just find the shortest route. It weights the toll, the traffic density, the road reliability. It steers you toward the path you can actually take — not just the one that looks best on a map."</w:t>
-      </w:r>
-    </w:p>
-    <w:p>
-      <w:pPr>
-        <w:pStyle w:val="Spoken"/>
-      </w:pPr>
-      <w:r>
-        <w:rPr>
-          <w:i/>
-          <w:color w:val="1A1A2E"/>
-        </w:rPr>
-        <w:t>"That is exactly what we are doing. Except the map is a live financial network, and the traffic is real-time order-book data."</w:t>
+        <w:t>SLIDE 5 · Baselines Fail · 2:50 – 3:10</w:t>
       </w:r>
     </w:p>
     <w:p>
@@ -1266,133 +417,13 @@
     </w:p>
     <w:p>
       <w:pPr>
-        <w:pStyle w:val="SlideHeader"/>
-        <w:pBdr>
-          <w:left w:val="single" w:sz="24" w:space="6" w:color="CC0633"/>
-        </w:pBdr>
-      </w:pPr>
-      <w:r>
-        <w:t>SLIDE 6 · Three Heuristics · 4:30 – 5:25</w:t>
-      </w:r>
-    </w:p>
-    <w:p>
-      <w:pPr>
-        <w:spacing w:after="80"/>
-        <w:ind w:left="432"/>
-        <w:shd w:val="clear" w:color="auto" w:fill="E8EAF6"/>
+        <w:pStyle w:val="Heading2"/>
       </w:pPr>
       <w:r>
         <w:rPr>
-          <w:rFonts w:ascii="Courier New" w:hAnsi="Courier New"/>
-          <w:color w:val="444444"/>
-          <w:sz w:val="18"/>
-        </w:rPr>
-        <w:t>[SLIDE: Three vertical panels. h₁: Liquidity — 'Is there enough market depth?' | h₂ ★: Slippage — 'Does my order move the price?' | h₃: Chain + Venue — 'Will it settle in time?' Reveal one panel at a time on click.]</w:t>
-      </w:r>
-    </w:p>
-    <w:p>
-      <w:pPr>
-        <w:pStyle w:val="Visual"/>
-        <w:pBdr>
-          <w:left w:val="single" w:sz="12" w:space="6" w:color="FF9800"/>
-        </w:pBdr>
-        <w:shd w:val="clear" w:color="auto" w:fill="FFF8E1"/>
-      </w:pPr>
-      <w:r>
-        <w:rPr>
-          <w:b/>
-          <w:color w:val="E65100"/>
-        </w:rPr>
-        <w:t xml:space="preserve">▶ Visual: </w:t>
-      </w:r>
-      <w:r>
-        <w:rPr>
-          <w:color w:val="6D4000"/>
-        </w:rPr>
-        <w:t>Keep each panel clean: one icon, one line, the heuristic formula in small text below. Mark h₂ with a star — it is the novel contribution and the one that works.</w:t>
-      </w:r>
-    </w:p>
-    <w:p/>
-    <w:p>
-      <w:pPr>
-        <w:pStyle w:val="Spoken"/>
-      </w:pPr>
-      <w:r>
-        <w:rPr>
-          <w:i/>
           <w:color w:val="1A1A2E"/>
         </w:rPr>
-        <w:t>"We designed three guidance heuristics. Each one estimates a different dimension of execution risk, and each adds that estimate to the priority function — steering A* away from paths that look profitable but cannot be executed."</w:t>
-      </w:r>
-    </w:p>
-    <w:p>
-      <w:pPr>
-        <w:pStyle w:val="Direction"/>
-      </w:pPr>
-      <w:r>
-        <w:rPr>
-          <w:color w:val="555555"/>
-        </w:rPr>
-        <w:t>[DIRECTION: Reveal each panel as you name it. One breath between each. Do not rush through them.]</w:t>
-      </w:r>
-    </w:p>
-    <w:p>
-      <w:pPr>
-        <w:pStyle w:val="Spoken"/>
-      </w:pPr>
-      <w:r>
-        <w:rPr>
-          <w:i/>
-          <w:color w:val="1A1A2E"/>
-        </w:rPr>
-        <w:t>"Heuristic one: Liquidity. Is there enough market depth in this venue to support our order size right now, without exhausting the book?"</w:t>
-      </w:r>
-    </w:p>
-    <w:p>
-      <w:pPr>
-        <w:pStyle w:val="Spoken"/>
-      </w:pPr>
-      <w:r>
-        <w:rPr>
-          <w:i/>
-          <w:color w:val="1A1A2E"/>
-        </w:rPr>
-        <w:t>"Heuristic two: Slippage. This is our novel contribution. Using live order-book data, we compute the volume-weighted average price of filling our order — and penalize paths where that price diverges too far from the mid-price. It is dynamic. It updates with the market."</w:t>
-      </w:r>
-    </w:p>
-    <w:p>
-      <w:pPr>
-        <w:pStyle w:val="Spoken"/>
-      </w:pPr>
-      <w:r>
-        <w:rPr>
-          <w:i/>
-          <w:color w:val="1A1A2E"/>
-        </w:rPr>
-        <w:t>"Heuristic three: Chain congestion and exchange reliability. How long will the blockchain transfer take? And how operationally reliable is this particular venue?"</w:t>
-      </w:r>
-    </w:p>
-    <w:p>
-      <w:pPr>
-        <w:pStyle w:val="Pause"/>
-      </w:pPr>
-      <w:r>
-        <w:rPr>
-          <w:color w:val="2277CC"/>
-        </w:rPr>
-        <w:t>[BEAT]</w:t>
-      </w:r>
-    </w:p>
-    <w:p>
-      <w:pPr>
-        <w:pStyle w:val="Spoken"/>
-      </w:pPr>
-      <w:r>
-        <w:rPr>
-          <w:i/>
-          <w:color w:val="1A1A2E"/>
-        </w:rPr>
-        <w:t>"One of these three will prove decisive."</w:t>
+        <w:t>SLIDE 6 · The Dataset · 3:10 – 3:40</w:t>
       </w:r>
     </w:p>
     <w:p>
@@ -1405,213 +436,13 @@
     </w:p>
     <w:p>
       <w:pPr>
-        <w:pStyle w:val="SlideHeader"/>
-        <w:pBdr>
-          <w:left w:val="single" w:sz="24" w:space="6" w:color="CC0633"/>
-        </w:pBdr>
-      </w:pPr>
-      <w:r>
-        <w:t>SLIDE 7 · The Result · 5:25 – 6:20</w:t>
-      </w:r>
-    </w:p>
-    <w:p>
-      <w:pPr>
-        <w:spacing w:after="80"/>
-        <w:ind w:left="432"/>
-        <w:shd w:val="clear" w:color="auto" w:fill="E8EAF6"/>
+        <w:pStyle w:val="Heading2"/>
       </w:pPr>
       <w:r>
         <w:rPr>
-          <w:rFonts w:ascii="Courier New" w:hAnsi="Courier New"/>
-          <w:color w:val="444444"/>
-          <w:sz w:val="18"/>
-        </w:rPr>
-        <w:t>[SLIDE: TOP: fig01_node_expansion_bar.png — bar chart (Dijkstra vs h₁ vs h₂ vs h₃), h₂ highlighted in SFU red, '−29%' annotation. BOTTOM: CameraReadySuccesfulPathProfit.png — actual found profitable path, labelled with the profit amount.]</w:t>
-      </w:r>
-    </w:p>
-    <w:p>
-      <w:pPr>
-        <w:pStyle w:val="Visual"/>
-        <w:pBdr>
-          <w:left w:val="single" w:sz="12" w:space="6" w:color="FF9800"/>
-        </w:pBdr>
-        <w:shd w:val="clear" w:color="auto" w:fill="FFF8E1"/>
-      </w:pPr>
-      <w:r>
-        <w:rPr>
-          <w:b/>
-          <w:color w:val="E65100"/>
-        </w:rPr>
-        <w:t xml:space="preserve">▶ Visual: </w:t>
-      </w:r>
-      <w:r>
-        <w:rPr>
-          <w:color w:val="6D4000"/>
-        </w:rPr>
-        <w:t>The bar chart is the evidence. The found path image is the proof of life — it makes the abstract concrete. The profit label should be large and readable from the back of the room.</w:t>
-      </w:r>
-    </w:p>
-    <w:p/>
-    <w:p>
-      <w:pPr>
-        <w:pStyle w:val="Direction"/>
-      </w:pPr>
-      <w:r>
-        <w:rPr>
-          <w:color w:val="555555"/>
-        </w:rPr>
-        <w:t>[DIRECTION: Slow down. Every sentence here gets its own breath. This is the payoff.]</w:t>
-      </w:r>
-    </w:p>
-    <w:p>
-      <w:pPr>
-        <w:pStyle w:val="Spoken"/>
-      </w:pPr>
-      <w:r>
-        <w:rPr>
-          <w:i/>
           <w:color w:val="1A1A2E"/>
         </w:rPr>
-        <w:t>"Here is what we found."</w:t>
-      </w:r>
-    </w:p>
-    <w:p>
-      <w:pPr>
-        <w:pStyle w:val="Pause"/>
-      </w:pPr>
-      <w:r>
-        <w:rPr>
-          <w:color w:val="2277CC"/>
-        </w:rPr>
-        <w:t>[PAUSE]</w:t>
-      </w:r>
-    </w:p>
-    <w:p>
-      <w:pPr>
-        <w:pStyle w:val="Spoken"/>
-      </w:pPr>
-      <w:r>
-        <w:rPr>
-          <w:i/>
-          <w:color w:val="1A1A2E"/>
-        </w:rPr>
-        <w:t>"Our slippage-aware heuristic — h-two — achieved the same profit quality as the Dijkstra baseline. Within one percent."</w:t>
-      </w:r>
-    </w:p>
-    <w:p>
-      <w:pPr>
-        <w:pStyle w:val="Pause"/>
-      </w:pPr>
-      <w:r>
-        <w:rPr>
-          <w:color w:val="2277CC"/>
-        </w:rPr>
-        <w:t>[PAUSE]</w:t>
-      </w:r>
-    </w:p>
-    <w:p>
-      <w:pPr>
-        <w:pStyle w:val="Spoken"/>
-      </w:pPr>
-      <w:r>
-        <w:rPr>
-          <w:i/>
-          <w:color w:val="1A1A2E"/>
-        </w:rPr>
-        <w:t>"But it did so using twenty-nine percent fewer node expansions."</w:t>
-      </w:r>
-    </w:p>
-    <w:p>
-      <w:pPr>
-        <w:pStyle w:val="Pause"/>
-      </w:pPr>
-      <w:r>
-        <w:rPr>
-          <w:color w:val="2277CC"/>
-        </w:rPr>
-        <w:t>[BEAT]</w:t>
-      </w:r>
-    </w:p>
-    <w:p>
-      <w:pPr>
-        <w:pStyle w:val="Spoken"/>
-      </w:pPr>
-      <w:r>
-        <w:rPr>
-          <w:i/>
-          <w:color w:val="1A1A2E"/>
-        </w:rPr>
-        <w:t>"Same destination. Same profit. Twenty-nine percent less work."</w:t>
-      </w:r>
-    </w:p>
-    <w:p>
-      <w:pPr>
-        <w:pStyle w:val="Pause"/>
-      </w:pPr>
-      <w:r>
-        <w:rPr>
-          <w:color w:val="2277CC"/>
-        </w:rPr>
-        <w:t>[PAUSE]</w:t>
-      </w:r>
-    </w:p>
-    <w:p>
-      <w:pPr>
-        <w:pStyle w:val="Spoken"/>
-      </w:pPr>
-      <w:r>
-        <w:rPr>
-          <w:i/>
-          <w:color w:val="1A1A2E"/>
-        </w:rPr>
-        <w:t>"And this —"</w:t>
-      </w:r>
-    </w:p>
-    <w:p>
-      <w:pPr>
-        <w:pStyle w:val="Direction"/>
-      </w:pPr>
-      <w:r>
-        <w:rPr>
-          <w:color w:val="555555"/>
-        </w:rPr>
-        <w:t>[DIRECTION: Gesture to the bottom image on the slide.]</w:t>
-      </w:r>
-    </w:p>
-    <w:p>
-      <w:pPr>
-        <w:pStyle w:val="Spoken"/>
-      </w:pPr>
-      <w:r>
-        <w:rPr>
-          <w:i/>
-          <w:color w:val="1A1A2E"/>
-        </w:rPr>
-        <w:t>"— is a real path our system found. Kraken to KuCoin, USDT to TUSD. Nine dollars and ninety-one cents profit on a ten-thousand dollar order. Found in under ten milliseconds of search time."</w:t>
-      </w:r>
-    </w:p>
-    <w:p>
-      <w:pPr>
-        <w:pStyle w:val="Spoken"/>
-      </w:pPr>
-      <w:r>
-        <w:rPr>
-          <w:i/>
-          <w:color w:val="1A1A2E"/>
-        </w:rPr>
-        <w:t>"We ran this across an eight-hour overnight campaign — seven thousand two hundred search instances, live market data, continuous operation. Every A* run in that campaign found a profitable path. When we re-evaluated those paths two minutes later, accounting for quotes that had gone stale — ninety-nine point six percent were still profitable."</w:t>
-      </w:r>
-    </w:p>
-    <w:p>
-      <w:pPr>
-        <w:pStyle w:val="Spoken"/>
-      </w:pPr>
-      <w:r>
-        <w:rPr>
-          <w:i/>
-          <w:color w:val="1A1A2E"/>
-        </w:rPr>
-        <w:t>"That is not a simulation artifact. That is a system working under real market conditions."</w:t>
+        <w:t>SLIDE 7 · Method: A Search · 3:40 – 4:20</w:t>
       </w:r>
     </w:p>
     <w:p>
@@ -1624,133 +455,13 @@
     </w:p>
     <w:p>
       <w:pPr>
-        <w:pStyle w:val="SlideHeader"/>
-        <w:pBdr>
-          <w:left w:val="single" w:sz="24" w:space="6" w:color="CC0633"/>
-        </w:pBdr>
-      </w:pPr>
-      <w:r>
-        <w:t>SLIDE 8 · Why It Matters · 6:20 – 7:25</w:t>
-      </w:r>
-    </w:p>
-    <w:p>
-      <w:pPr>
-        <w:spacing w:after="80"/>
-        <w:ind w:left="432"/>
-        <w:shd w:val="clear" w:color="auto" w:fill="E8EAF6"/>
+        <w:pStyle w:val="Heading2"/>
       </w:pPr>
       <w:r>
         <w:rPr>
-          <w:rFonts w:ascii="Courier New" w:hAnsi="Courier New"/>
-          <w:color w:val="444444"/>
-          <w:sz w:val="18"/>
-        </w:rPr>
-        <w:t>[SLIDE: Left half — price divergence chart showing the same stablecoin at two different prices across two exchanges during market stress. Right half — bullet points on geopolitical scenarios.]</w:t>
-      </w:r>
-    </w:p>
-    <w:p>
-      <w:pPr>
-        <w:pStyle w:val="Visual"/>
-        <w:pBdr>
-          <w:left w:val="single" w:sz="12" w:space="6" w:color="FF9800"/>
-        </w:pBdr>
-        <w:shd w:val="clear" w:color="auto" w:fill="FFF8E1"/>
-      </w:pPr>
-      <w:r>
-        <w:rPr>
-          <w:b/>
-          <w:color w:val="E65100"/>
-        </w:rPr>
-        <w:t xml:space="preserve">▶ Visual: </w:t>
-      </w:r>
-      <w:r>
-        <w:rPr>
-          <w:color w:val="6D4000"/>
-        </w:rPr>
-        <w:t>The price divergence chart makes the abstract tangible. Show an actual divergence event — not hypothetical. If you have one from your overnight data, use it.</w:t>
-      </w:r>
-    </w:p>
-    <w:p/>
-    <w:p>
-      <w:pPr>
-        <w:pStyle w:val="Direction"/>
-      </w:pPr>
-      <w:r>
-        <w:rPr>
-          <w:color w:val="555555"/>
-        </w:rPr>
-        <w:t>[DIRECTION: Energy rises here. This is the vision. Speak with conviction.]</w:t>
-      </w:r>
-    </w:p>
-    <w:p>
-      <w:pPr>
-        <w:pStyle w:val="Spoken"/>
-      </w:pPr>
-      <w:r>
-        <w:rPr>
-          <w:i/>
           <w:color w:val="1A1A2E"/>
         </w:rPr>
-        <w:t>"Now you might be thinking — this is a niche trading problem. Why does it belong at an AI conference?"</w:t>
-      </w:r>
-    </w:p>
-    <w:p>
-      <w:pPr>
-        <w:pStyle w:val="Pause"/>
-      </w:pPr>
-      <w:r>
-        <w:rPr>
-          <w:color w:val="2277CC"/>
-        </w:rPr>
-        <w:t>[BEAT]</w:t>
-      </w:r>
-    </w:p>
-    <w:p>
-      <w:pPr>
-        <w:pStyle w:val="Spoken"/>
-      </w:pPr>
-      <w:r>
-        <w:rPr>
-          <w:i/>
-          <w:color w:val="1A1A2E"/>
-        </w:rPr>
-        <w:t>"Consider what happens to stablecoin markets during moments of geopolitical shock. A war breaks out. A government announces an exchange freeze. A major venue halts withdrawals overnight. These are the moments when price discrepancies across independent exchanges spike — not by fractions of a percent, but by meaningful margins, in real time."</w:t>
-      </w:r>
-    </w:p>
-    <w:p>
-      <w:pPr>
-        <w:pStyle w:val="Spoken"/>
-      </w:pPr>
-      <w:r>
-        <w:rPr>
-          <w:i/>
-          <w:color w:val="1A1A2E"/>
-        </w:rPr>
-        <w:t>"A system that can navigate those disruptions — twenty-nine percent more efficiently than the baseline — is not just a trading tool. It is a lens for understanding how fragmented financial markets behave under stress. That is a research question with implications well beyond cryptocurrency."</w:t>
-      </w:r>
-    </w:p>
-    <w:p>
-      <w:pPr>
-        <w:pStyle w:val="Spoken"/>
-      </w:pPr>
-      <w:r>
-        <w:rPr>
-          <w:i/>
-          <w:color w:val="1A1A2E"/>
-        </w:rPr>
-        <w:t>"And the framework we built here is a foundation. Decentralized exchanges — Uniswap, Curve — are the natural next frontier. Continuous pricing invariants, automated market makers, on-chain liquidity: a richer search space that demands exactly this kind of execution-aware pathfinding."</w:t>
-      </w:r>
-    </w:p>
-    <w:p>
-      <w:pPr>
-        <w:pStyle w:val="Spoken"/>
-      </w:pPr>
-      <w:r>
-        <w:rPr>
-          <w:i/>
-          <w:color w:val="1A1A2E"/>
-        </w:rPr>
-        <w:t>"The market is expanding. The navigation tools need to scale with it."</w:t>
+        <w:t>SLIDE 8 · Three Heuristics · 4:20 – 5:10</w:t>
       </w:r>
     </w:p>
     <w:p>
@@ -1763,144 +474,956 @@
     </w:p>
     <w:p>
       <w:pPr>
-        <w:pStyle w:val="SlideHeader"/>
-        <w:pBdr>
-          <w:left w:val="single" w:sz="24" w:space="6" w:color="CC0633"/>
-        </w:pBdr>
+        <w:pStyle w:val="Heading2"/>
       </w:pPr>
       <w:r>
-        <w:t>SLIDE 9 · Close · 7:25 – 8:00</w:t>
+        <w:rPr>
+          <w:color w:val="1A1A2E"/>
+        </w:rPr>
+        <w:t>SLIDE 9 · Key Result · 5:10 – 5:40</w:t>
       </w:r>
     </w:p>
     <w:p>
       <w:pPr>
+        <w:pBdr>
+          <w:bottom w:val="single" w:sz="4" w:space="1" w:color="CCCCCC"/>
+        </w:pBdr>
         <w:spacing w:after="80"/>
-        <w:ind w:left="432"/>
-        <w:shd w:val="clear" w:color="auto" w:fill="E8EAF6"/>
+      </w:pPr>
+    </w:p>
+    <w:p>
+      <w:pPr>
+        <w:pStyle w:val="Heading2"/>
       </w:pPr>
       <w:r>
         <w:rPr>
-          <w:rFonts w:ascii="Courier New" w:hAnsi="Courier New"/>
-          <w:color w:val="444444"/>
-          <w:sz w:val="18"/>
+          <w:color w:val="1A1A2E"/>
         </w:rPr>
-        <w:t>[SLIDE: FullGraph.png again — full bleed, same opening image — but now a single glowing path runs through it. Text overlay, centred, large: 'Less Exploration. More Execution. Same Profit.']</w:t>
+        <w:t>SLIDE 10 · Profit Quality &amp; Speed · 5:40 – 6:00</w:t>
       </w:r>
     </w:p>
     <w:p>
       <w:pPr>
-        <w:pStyle w:val="Visual"/>
         <w:pBdr>
-          <w:left w:val="single" w:sz="12" w:space="6" w:color="FF9800"/>
+          <w:bottom w:val="single" w:sz="4" w:space="1" w:color="CCCCCC"/>
         </w:pBdr>
-        <w:shd w:val="clear" w:color="auto" w:fill="FFF8E1"/>
+        <w:spacing w:after="80"/>
+      </w:pPr>
+    </w:p>
+    <w:p>
+      <w:pPr>
+        <w:pStyle w:val="Heading2"/>
       </w:pPr>
       <w:r>
         <w:rPr>
-          <w:b/>
-          <w:color w:val="E65100"/>
+          <w:color w:val="1A1A2E"/>
         </w:rPr>
-        <w:t xml:space="preserve">▶ Visual: </w:t>
-      </w:r>
-      <w:r>
-        <w:rPr>
-          <w:color w:val="6D4000"/>
-        </w:rPr>
-        <w:t>This is the visual callback. The audience saw this graph at the start, before you spoke. Now it has meaning. The single glowing path is the answer to the question you opened with.</w:t>
-      </w:r>
-    </w:p>
-    <w:p/>
-    <w:p>
-      <w:pPr>
-        <w:pStyle w:val="Direction"/>
-      </w:pPr>
-      <w:r>
-        <w:rPr>
-          <w:color w:val="555555"/>
-        </w:rPr>
-        <w:t>[DIRECTION: Return to centre. Slow your pace to below your normal speaking speed. This is the callback.]</w:t>
+        <w:t>SLIDE 11 · Overnight Campaign · 6:00 – 6:22</w:t>
       </w:r>
     </w:p>
     <w:p>
       <w:pPr>
-        <w:pStyle w:val="Spoken"/>
+        <w:pBdr>
+          <w:bottom w:val="single" w:sz="4" w:space="1" w:color="CCCCCC"/>
+        </w:pBdr>
+        <w:spacing w:after="80"/>
+      </w:pPr>
+    </w:p>
+    <w:p>
+      <w:pPr>
+        <w:pStyle w:val="Heading2"/>
       </w:pPr>
       <w:r>
         <w:rPr>
-          <w:i/>
           <w:color w:val="1A1A2E"/>
         </w:rPr>
-        <w:t>"We started with a question: how do you find the most profitable, actually executable path through a thirty-three trillion dollar market?"</w:t>
+        <w:t>SLIDE 12 · Execution Window · 6:22 – 6:38</w:t>
       </w:r>
     </w:p>
     <w:p>
       <w:pPr>
-        <w:pStyle w:val="Spoken"/>
+        <w:pBdr>
+          <w:bottom w:val="single" w:sz="4" w:space="1" w:color="CCCCCC"/>
+        </w:pBdr>
+        <w:spacing w:after="80"/>
+      </w:pPr>
+    </w:p>
+    <w:p>
+      <w:pPr>
+        <w:pStyle w:val="Heading2"/>
       </w:pPr>
       <w:r>
         <w:rPr>
-          <w:i/>
           <w:color w:val="1A1A2E"/>
         </w:rPr>
-        <w:t>"The answer: model the ecosystem as a graph. Encode every real-world cost as an edge weight. Apply A* search, guided by a slippage-aware heuristic that steers search toward paths the market can actually support."</w:t>
+        <w:t>SLIDE 13 · Why It Matters + Close · 6:38 – 8:00</w:t>
       </w:r>
     </w:p>
     <w:p>
       <w:pPr>
-        <w:pStyle w:val="Pause"/>
+        <w:pBdr>
+          <w:bottom w:val="single" w:sz="4" w:space="1" w:color="CCCCCC"/>
+        </w:pBdr>
+        <w:spacing w:after="80"/>
       </w:pPr>
-      <w:r>
-        <w:rPr>
-          <w:color w:val="2277CC"/>
-        </w:rPr>
-        <w:t>[PAUSE]</w:t>
-      </w:r>
     </w:p>
     <w:p>
       <w:pPr>
-        <w:pStyle w:val="Spoken"/>
+        <w:pBdr>
+          <w:bottom w:val="single" w:sz="4" w:space="1" w:color="CCCCCC"/>
+        </w:pBdr>
+        <w:spacing w:after="80"/>
       </w:pPr>
-      <w:r>
-        <w:rPr>
-          <w:i/>
-          <w:color w:val="1A1A2E"/>
-        </w:rPr>
-        <w:t>"Less exploration. More execution. Same profit."</w:t>
-      </w:r>
     </w:p>
     <w:p>
       <w:pPr>
-        <w:pStyle w:val="Pause"/>
+        <w:pStyle w:val="Heading2"/>
       </w:pPr>
       <w:r>
-        <w:rPr>
-          <w:color w:val="2277CC"/>
-        </w:rPr>
-        <w:t>[PAUSE — two full seconds. Make eye contact. Do not add anything.]</w:t>
+        <w:t>Slide Visual Guide — Quick Reference (v2 — 13 slides)</w:t>
       </w:r>
     </w:p>
+    <w:tbl>
+      <w:tblPr>
+        <w:tblStyle w:val="TableGrid"/>
+        <w:tblW w:type="auto" w:w="0"/>
+        <w:tblLook w:firstColumn="1" w:firstRow="1" w:lastColumn="0" w:lastRow="0" w:noHBand="0" w:noVBand="1" w:val="04A0"/>
+      </w:tblPr>
+      <w:tblGrid>
+        <w:gridCol w:w="1908"/>
+        <w:gridCol w:w="1908"/>
+        <w:gridCol w:w="1908"/>
+        <w:gridCol w:w="1908"/>
+      </w:tblGrid>
+      <w:tr>
+        <w:tc>
+          <w:tcPr>
+            <w:tcW w:type="dxa" w:w="2952"/>
+            <w:shd w:val="clear" w:color="auto" w:fill="CC0633"/>
+          </w:tcPr>
+          <w:p>
+            <w:r>
+              <w:rPr>
+                <w:b/>
+                <w:color w:val="FFFFFF"/>
+                <w:sz w:val="20"/>
+              </w:rPr>
+              <w:t>Slide</w:t>
+            </w:r>
+          </w:p>
+        </w:tc>
+        <w:tc>
+          <w:tcPr>
+            <w:tcW w:type="dxa" w:w="2952"/>
+            <w:shd w:val="clear" w:color="auto" w:fill="CC0633"/>
+          </w:tcPr>
+          <w:p>
+            <w:r>
+              <w:rPr>
+                <w:b/>
+                <w:color w:val="FFFFFF"/>
+                <w:sz w:val="20"/>
+              </w:rPr>
+              <w:t>Title</w:t>
+            </w:r>
+          </w:p>
+        </w:tc>
+        <w:tc>
+          <w:tcPr>
+            <w:tcW w:type="dxa" w:w="2952"/>
+            <w:shd w:val="clear" w:color="auto" w:fill="CC0633"/>
+          </w:tcPr>
+          <w:p>
+            <w:r>
+              <w:rPr>
+                <w:b/>
+                <w:color w:val="FFFFFF"/>
+                <w:sz w:val="20"/>
+              </w:rPr>
+              <w:t>Key visual</w:t>
+            </w:r>
+          </w:p>
+        </w:tc>
+        <w:tc>
+          <w:tcPr>
+            <w:tcW w:type="dxa" w:w="2952"/>
+            <w:shd w:val="clear" w:color="auto" w:fill="CC0633"/>
+          </w:tcPr>
+          <w:p>
+            <w:r>
+              <w:rPr>
+                <w:b/>
+                <w:color w:val="FFFFFF"/>
+                <w:sz w:val="20"/>
+              </w:rPr>
+              <w:t>Source</w:t>
+            </w:r>
+          </w:p>
+        </w:tc>
+      </w:tr>
+      <w:tr>
+        <w:tc>
+          <w:tcPr>
+            <w:tcW w:type="dxa" w:w="2952"/>
+            <w:shd w:val="clear" w:color="auto" w:fill="F2F2F7"/>
+          </w:tcPr>
+          <w:p>
+            <w:r>
+              <w:rPr>
+                <w:sz w:val="20"/>
+              </w:rPr>
+              <w:t>1</w:t>
+            </w:r>
+          </w:p>
+        </w:tc>
+        <w:tc>
+          <w:tcPr>
+            <w:tcW w:type="dxa" w:w="2952"/>
+            <w:shd w:val="clear" w:color="auto" w:fill="F2F2F7"/>
+          </w:tcPr>
+          <w:p>
+            <w:r>
+              <w:rPr>
+                <w:sz w:val="20"/>
+              </w:rPr>
+              <w:t>Title</w:t>
+            </w:r>
+          </w:p>
+        </w:tc>
+        <w:tc>
+          <w:tcPr>
+            <w:tcW w:type="dxa" w:w="2952"/>
+            <w:shd w:val="clear" w:color="auto" w:fill="F2F2F7"/>
+          </w:tcPr>
+          <w:p>
+            <w:r>
+              <w:rPr>
+                <w:sz w:val="20"/>
+              </w:rPr>
+              <w:t>FullGraph.png full-bleed background at low opacity</w:t>
+            </w:r>
+          </w:p>
+        </w:tc>
+        <w:tc>
+          <w:tcPr>
+            <w:tcW w:type="dxa" w:w="2952"/>
+            <w:shd w:val="clear" w:color="auto" w:fill="F2F2F7"/>
+          </w:tcPr>
+          <w:p>
+            <w:r>
+              <w:rPr>
+                <w:sz w:val="20"/>
+              </w:rPr>
+              <w:t>`figures/FullGraph.png`</w:t>
+            </w:r>
+          </w:p>
+        </w:tc>
+      </w:tr>
+      <w:tr>
+        <w:tc>
+          <w:tcPr>
+            <w:tcW w:type="dxa" w:w="2952"/>
+            <w:shd w:val="clear" w:color="auto" w:fill="FFFFFF"/>
+          </w:tcPr>
+          <w:p>
+            <w:r>
+              <w:rPr>
+                <w:sz w:val="20"/>
+              </w:rPr>
+              <w:t>2</w:t>
+            </w:r>
+          </w:p>
+        </w:tc>
+        <w:tc>
+          <w:tcPr>
+            <w:tcW w:type="dxa" w:w="2952"/>
+            <w:shd w:val="clear" w:color="auto" w:fill="FFFFFF"/>
+          </w:tcPr>
+          <w:p>
+            <w:r>
+              <w:rPr>
+                <w:sz w:val="20"/>
+              </w:rPr>
+              <w:t>Market</w:t>
+            </w:r>
+          </w:p>
+        </w:tc>
+        <w:tc>
+          <w:tcPr>
+            <w:tcW w:type="dxa" w:w="2952"/>
+            <w:shd w:val="clear" w:color="auto" w:fill="FFFFFF"/>
+          </w:tcPr>
+          <w:p>
+            <w:r>
+              <w:rPr>
+                <w:sz w:val="20"/>
+              </w:rPr>
+              <w:t>Bar chart: MC $9T / Visa $15T / Stablecoins $33T + stat callouts</w:t>
+            </w:r>
+          </w:p>
+        </w:tc>
+        <w:tc>
+          <w:tcPr>
+            <w:tcW w:type="dxa" w:w="2952"/>
+            <w:shd w:val="clear" w:color="auto" w:fill="FFFFFF"/>
+          </w:tcPr>
+          <w:p>
+            <w:r>
+              <w:rPr>
+                <w:sz w:val="20"/>
+              </w:rPr>
+              <w:t>`v2_market.png` (generated)</w:t>
+            </w:r>
+          </w:p>
+        </w:tc>
+      </w:tr>
+      <w:tr>
+        <w:tc>
+          <w:tcPr>
+            <w:tcW w:type="dxa" w:w="2952"/>
+            <w:shd w:val="clear" w:color="auto" w:fill="F2F2F7"/>
+          </w:tcPr>
+          <w:p>
+            <w:r>
+              <w:rPr>
+                <w:sz w:val="20"/>
+              </w:rPr>
+              <w:t>3</w:t>
+            </w:r>
+          </w:p>
+        </w:tc>
+        <w:tc>
+          <w:tcPr>
+            <w:tcW w:type="dxa" w:w="2952"/>
+            <w:shd w:val="clear" w:color="auto" w:fill="F2F2F7"/>
+          </w:tcPr>
+          <w:p>
+            <w:r>
+              <w:rPr>
+                <w:sz w:val="20"/>
+              </w:rPr>
+              <w:t>Price Fragmentation</w:t>
+            </w:r>
+          </w:p>
+        </w:tc>
+        <w:tc>
+          <w:tcPr>
+            <w:tcW w:type="dxa" w:w="2952"/>
+            <w:shd w:val="clear" w:color="auto" w:fill="F2F2F7"/>
+          </w:tcPr>
+          <w:p>
+            <w:r>
+              <w:rPr>
+                <w:sz w:val="20"/>
+              </w:rPr>
+              <w:t>Horizontal bar: USDT mid-price across 12 exchanges, spread annotated</w:t>
+            </w:r>
+          </w:p>
+        </w:tc>
+        <w:tc>
+          <w:tcPr>
+            <w:tcW w:type="dxa" w:w="2952"/>
+            <w:shd w:val="clear" w:color="auto" w:fill="F2F2F7"/>
+          </w:tcPr>
+          <w:p>
+            <w:r>
+              <w:rPr>
+                <w:sz w:val="20"/>
+              </w:rPr>
+              <w:t>`v2_price_table.png` (generated)</w:t>
+            </w:r>
+          </w:p>
+        </w:tc>
+      </w:tr>
+      <w:tr>
+        <w:tc>
+          <w:tcPr>
+            <w:tcW w:type="dxa" w:w="2952"/>
+            <w:shd w:val="clear" w:color="auto" w:fill="FFFFFF"/>
+          </w:tcPr>
+          <w:p>
+            <w:r>
+              <w:rPr>
+                <w:sz w:val="20"/>
+              </w:rPr>
+              <w:t>4</w:t>
+            </w:r>
+          </w:p>
+        </w:tc>
+        <w:tc>
+          <w:tcPr>
+            <w:tcW w:type="dxa" w:w="2952"/>
+            <w:shd w:val="clear" w:color="auto" w:fill="FFFFFF"/>
+          </w:tcPr>
+          <w:p>
+            <w:r>
+              <w:rPr>
+                <w:sz w:val="20"/>
+              </w:rPr>
+              <w:t>Execution Barriers</w:t>
+            </w:r>
+          </w:p>
+        </w:tc>
+        <w:tc>
+          <w:tcPr>
+            <w:tcW w:type="dxa" w:w="2952"/>
+            <w:shd w:val="clear" w:color="auto" w:fill="FFFFFF"/>
+          </w:tcPr>
+          <w:p>
+            <w:r>
+              <w:rPr>
+                <w:sz w:val="20"/>
+              </w:rPr>
+              <w:t>Four colour-coded challenge cards</w:t>
+            </w:r>
+          </w:p>
+        </w:tc>
+        <w:tc>
+          <w:tcPr>
+            <w:tcW w:type="dxa" w:w="2952"/>
+            <w:shd w:val="clear" w:color="auto" w:fill="FFFFFF"/>
+          </w:tcPr>
+          <w:p>
+            <w:r>
+              <w:rPr>
+                <w:sz w:val="20"/>
+              </w:rPr>
+              <w:t>Generated in fill_slides_v2.py</w:t>
+            </w:r>
+          </w:p>
+        </w:tc>
+      </w:tr>
+      <w:tr>
+        <w:tc>
+          <w:tcPr>
+            <w:tcW w:type="dxa" w:w="2952"/>
+            <w:shd w:val="clear" w:color="auto" w:fill="F2F2F7"/>
+          </w:tcPr>
+          <w:p>
+            <w:r>
+              <w:rPr>
+                <w:sz w:val="20"/>
+              </w:rPr>
+              <w:t>5</w:t>
+            </w:r>
+          </w:p>
+        </w:tc>
+        <w:tc>
+          <w:tcPr>
+            <w:tcW w:type="dxa" w:w="2952"/>
+            <w:shd w:val="clear" w:color="auto" w:fill="F2F2F7"/>
+          </w:tcPr>
+          <w:p>
+            <w:r>
+              <w:rPr>
+                <w:sz w:val="20"/>
+              </w:rPr>
+              <w:t>Baselines Fail</w:t>
+            </w:r>
+          </w:p>
+        </w:tc>
+        <w:tc>
+          <w:tcPr>
+            <w:tcW w:type="dxa" w:w="2952"/>
+            <w:shd w:val="clear" w:color="auto" w:fill="F2F2F7"/>
+          </w:tcPr>
+          <w:p>
+            <w:r>
+              <w:rPr>
+                <w:sz w:val="20"/>
+              </w:rPr>
+              <w:t>Bar chart: Bellman-Ford/1-hop/2-hop = $0, A*+h₂ = $9.91</w:t>
+            </w:r>
+          </w:p>
+        </w:tc>
+        <w:tc>
+          <w:tcPr>
+            <w:tcW w:type="dxa" w:w="2952"/>
+            <w:shd w:val="clear" w:color="auto" w:fill="F2F2F7"/>
+          </w:tcPr>
+          <w:p>
+            <w:r>
+              <w:rPr>
+                <w:sz w:val="20"/>
+              </w:rPr>
+              <w:t>`v2_baselines.png` (generated)</w:t>
+            </w:r>
+          </w:p>
+        </w:tc>
+      </w:tr>
+      <w:tr>
+        <w:tc>
+          <w:tcPr>
+            <w:tcW w:type="dxa" w:w="2952"/>
+            <w:shd w:val="clear" w:color="auto" w:fill="FFFFFF"/>
+          </w:tcPr>
+          <w:p>
+            <w:r>
+              <w:rPr>
+                <w:sz w:val="20"/>
+              </w:rPr>
+              <w:t>6</w:t>
+            </w:r>
+          </w:p>
+        </w:tc>
+        <w:tc>
+          <w:tcPr>
+            <w:tcW w:type="dxa" w:w="2952"/>
+            <w:shd w:val="clear" w:color="auto" w:fill="FFFFFF"/>
+          </w:tcPr>
+          <w:p>
+            <w:r>
+              <w:rPr>
+                <w:sz w:val="20"/>
+              </w:rPr>
+              <w:t>Dataset</w:t>
+            </w:r>
+          </w:p>
+        </w:tc>
+        <w:tc>
+          <w:tcPr>
+            <w:tcW w:type="dxa" w:w="2952"/>
+            <w:shd w:val="clear" w:color="auto" w:fill="FFFFFF"/>
+          </w:tcPr>
+          <w:p>
+            <w:r>
+              <w:rPr>
+                <w:sz w:val="20"/>
+              </w:rPr>
+              <w:t>FullGraph.png + 4 stats (12 exch / 9 coins / 41 nodes / 864 edges)</w:t>
+            </w:r>
+          </w:p>
+        </w:tc>
+        <w:tc>
+          <w:tcPr>
+            <w:tcW w:type="dxa" w:w="2952"/>
+            <w:shd w:val="clear" w:color="auto" w:fill="FFFFFF"/>
+          </w:tcPr>
+          <w:p>
+            <w:r>
+              <w:rPr>
+                <w:sz w:val="20"/>
+              </w:rPr>
+              <w:t>`figures/FullGraph.png`</w:t>
+            </w:r>
+          </w:p>
+        </w:tc>
+      </w:tr>
+      <w:tr>
+        <w:tc>
+          <w:tcPr>
+            <w:tcW w:type="dxa" w:w="2952"/>
+            <w:shd w:val="clear" w:color="auto" w:fill="F2F2F7"/>
+          </w:tcPr>
+          <w:p>
+            <w:r>
+              <w:rPr>
+                <w:sz w:val="20"/>
+              </w:rPr>
+              <w:t>7</w:t>
+            </w:r>
+          </w:p>
+        </w:tc>
+        <w:tc>
+          <w:tcPr>
+            <w:tcW w:type="dxa" w:w="2952"/>
+            <w:shd w:val="clear" w:color="auto" w:fill="F2F2F7"/>
+          </w:tcPr>
+          <w:p>
+            <w:r>
+              <w:rPr>
+                <w:sz w:val="20"/>
+              </w:rPr>
+              <w:t>A* Method</w:t>
+            </w:r>
+          </w:p>
+        </w:tc>
+        <w:tc>
+          <w:tcPr>
+            <w:tcW w:type="dxa" w:w="2952"/>
+            <w:shd w:val="clear" w:color="auto" w:fill="F2F2F7"/>
+          </w:tcPr>
+          <w:p>
+            <w:r>
+              <w:rPr>
+                <w:sz w:val="20"/>
+              </w:rPr>
+              <w:t>f(n) formula + pipeline diagram (Data → Graph → A*+h₂ → Path)</w:t>
+            </w:r>
+          </w:p>
+        </w:tc>
+        <w:tc>
+          <w:tcPr>
+            <w:tcW w:type="dxa" w:w="2952"/>
+            <w:shd w:val="clear" w:color="auto" w:fill="F2F2F7"/>
+          </w:tcPr>
+          <w:p>
+            <w:r>
+              <w:rPr>
+                <w:sz w:val="20"/>
+              </w:rPr>
+              <w:t>`v2_pipeline.png` (generated)</w:t>
+            </w:r>
+          </w:p>
+        </w:tc>
+      </w:tr>
+      <w:tr>
+        <w:tc>
+          <w:tcPr>
+            <w:tcW w:type="dxa" w:w="2952"/>
+            <w:shd w:val="clear" w:color="auto" w:fill="FFFFFF"/>
+          </w:tcPr>
+          <w:p>
+            <w:r>
+              <w:rPr>
+                <w:sz w:val="20"/>
+              </w:rPr>
+              <w:t>8</w:t>
+            </w:r>
+          </w:p>
+        </w:tc>
+        <w:tc>
+          <w:tcPr>
+            <w:tcW w:type="dxa" w:w="2952"/>
+            <w:shd w:val="clear" w:color="auto" w:fill="FFFFFF"/>
+          </w:tcPr>
+          <w:p>
+            <w:r>
+              <w:rPr>
+                <w:sz w:val="20"/>
+              </w:rPr>
+              <w:t>Heuristics</w:t>
+            </w:r>
+          </w:p>
+        </w:tc>
+        <w:tc>
+          <w:tcPr>
+            <w:tcW w:type="dxa" w:w="2952"/>
+            <w:shd w:val="clear" w:color="auto" w:fill="FFFFFF"/>
+          </w:tcPr>
+          <w:p>
+            <w:r>
+              <w:rPr>
+                <w:sz w:val="20"/>
+              </w:rPr>
+              <w:t>Three panels (h₁/h₂★/h₃) + slippage curve for h₂</w:t>
+            </w:r>
+          </w:p>
+        </w:tc>
+        <w:tc>
+          <w:tcPr>
+            <w:tcW w:type="dxa" w:w="2952"/>
+            <w:shd w:val="clear" w:color="auto" w:fill="FFFFFF"/>
+          </w:tcPr>
+          <w:p>
+            <w:r>
+              <w:rPr>
+                <w:sz w:val="20"/>
+              </w:rPr>
+              <w:t>`v2_slippage.png` (generated)</w:t>
+            </w:r>
+          </w:p>
+        </w:tc>
+      </w:tr>
+      <w:tr>
+        <w:tc>
+          <w:tcPr>
+            <w:tcW w:type="dxa" w:w="2952"/>
+            <w:shd w:val="clear" w:color="auto" w:fill="F2F2F7"/>
+          </w:tcPr>
+          <w:p>
+            <w:r>
+              <w:rPr>
+                <w:sz w:val="20"/>
+              </w:rPr>
+              <w:t>9</w:t>
+            </w:r>
+          </w:p>
+        </w:tc>
+        <w:tc>
+          <w:tcPr>
+            <w:tcW w:type="dxa" w:w="2952"/>
+            <w:shd w:val="clear" w:color="auto" w:fill="F2F2F7"/>
+          </w:tcPr>
+          <w:p>
+            <w:r>
+              <w:rPr>
+                <w:sz w:val="20"/>
+              </w:rPr>
+              <w:t>Key Result</w:t>
+            </w:r>
+          </w:p>
+        </w:tc>
+        <w:tc>
+          <w:tcPr>
+            <w:tcW w:type="dxa" w:w="2952"/>
+            <w:shd w:val="clear" w:color="auto" w:fill="F2F2F7"/>
+          </w:tcPr>
+          <w:p>
+            <w:r>
+              <w:rPr>
+                <w:sz w:val="20"/>
+              </w:rPr>
+              <w:t>fig01_node_expansion_bar.png full-screen, h₂ highlighted, −29% large</w:t>
+            </w:r>
+          </w:p>
+        </w:tc>
+        <w:tc>
+          <w:tcPr>
+            <w:tcW w:type="dxa" w:w="2952"/>
+            <w:shd w:val="clear" w:color="auto" w:fill="F2F2F7"/>
+          </w:tcPr>
+          <w:p>
+            <w:r>
+              <w:rPr>
+                <w:sz w:val="20"/>
+              </w:rPr>
+              <w:t>`figures/fig01_node_expansion_bar.png`</w:t>
+            </w:r>
+          </w:p>
+        </w:tc>
+      </w:tr>
+      <w:tr>
+        <w:tc>
+          <w:tcPr>
+            <w:tcW w:type="dxa" w:w="2952"/>
+            <w:shd w:val="clear" w:color="auto" w:fill="FFFFFF"/>
+          </w:tcPr>
+          <w:p>
+            <w:r>
+              <w:rPr>
+                <w:sz w:val="20"/>
+              </w:rPr>
+              <w:t>10</w:t>
+            </w:r>
+          </w:p>
+        </w:tc>
+        <w:tc>
+          <w:tcPr>
+            <w:tcW w:type="dxa" w:w="2952"/>
+            <w:shd w:val="clear" w:color="auto" w:fill="FFFFFF"/>
+          </w:tcPr>
+          <w:p>
+            <w:r>
+              <w:rPr>
+                <w:sz w:val="20"/>
+              </w:rPr>
+              <w:t>Profit Quality</w:t>
+            </w:r>
+          </w:p>
+        </w:tc>
+        <w:tc>
+          <w:tcPr>
+            <w:tcW w:type="dxa" w:w="2952"/>
+            <w:shd w:val="clear" w:color="auto" w:fill="FFFFFF"/>
+          </w:tcPr>
+          <w:p>
+            <w:r>
+              <w:rPr>
+                <w:sz w:val="20"/>
+              </w:rPr>
+              <w:t>fig03 profit boxplot (LEFT) + fig02 compute time (RIGHT)</w:t>
+            </w:r>
+          </w:p>
+        </w:tc>
+        <w:tc>
+          <w:tcPr>
+            <w:tcW w:type="dxa" w:w="2952"/>
+            <w:shd w:val="clear" w:color="auto" w:fill="FFFFFF"/>
+          </w:tcPr>
+          <w:p>
+            <w:r>
+              <w:rPr>
+                <w:sz w:val="20"/>
+              </w:rPr>
+              <w:t>`figures/fig03_profit_boxplot.png` + `fig02`</w:t>
+            </w:r>
+          </w:p>
+        </w:tc>
+      </w:tr>
+      <w:tr>
+        <w:tc>
+          <w:tcPr>
+            <w:tcW w:type="dxa" w:w="2952"/>
+            <w:shd w:val="clear" w:color="auto" w:fill="F2F2F7"/>
+          </w:tcPr>
+          <w:p>
+            <w:r>
+              <w:rPr>
+                <w:sz w:val="20"/>
+              </w:rPr>
+              <w:t>11</w:t>
+            </w:r>
+          </w:p>
+        </w:tc>
+        <w:tc>
+          <w:tcPr>
+            <w:tcW w:type="dxa" w:w="2952"/>
+            <w:shd w:val="clear" w:color="auto" w:fill="F2F2F7"/>
+          </w:tcPr>
+          <w:p>
+            <w:r>
+              <w:rPr>
+                <w:sz w:val="20"/>
+              </w:rPr>
+              <w:t>Overnight</w:t>
+            </w:r>
+          </w:p>
+        </w:tc>
+        <w:tc>
+          <w:tcPr>
+            <w:tcW w:type="dxa" w:w="2952"/>
+            <w:shd w:val="clear" w:color="auto" w:fill="F2F2F7"/>
+          </w:tcPr>
+          <w:p>
+            <w:r>
+              <w:rPr>
+                <w:sz w:val="20"/>
+              </w:rPr>
+              <w:t>fig10 overnight time series (TOP) + fig11 heuristic comparison (BOTTOM)</w:t>
+            </w:r>
+          </w:p>
+        </w:tc>
+        <w:tc>
+          <w:tcPr>
+            <w:tcW w:type="dxa" w:w="2952"/>
+            <w:shd w:val="clear" w:color="auto" w:fill="F2F2F7"/>
+          </w:tcPr>
+          <w:p>
+            <w:r>
+              <w:rPr>
+                <w:sz w:val="20"/>
+              </w:rPr>
+              <w:t>`figures/fig10_overnight_timeseries.png` + `fig11`</w:t>
+            </w:r>
+          </w:p>
+        </w:tc>
+      </w:tr>
+      <w:tr>
+        <w:tc>
+          <w:tcPr>
+            <w:tcW w:type="dxa" w:w="2952"/>
+            <w:shd w:val="clear" w:color="auto" w:fill="FFFFFF"/>
+          </w:tcPr>
+          <w:p>
+            <w:r>
+              <w:rPr>
+                <w:sz w:val="20"/>
+              </w:rPr>
+              <w:t>12</w:t>
+            </w:r>
+          </w:p>
+        </w:tc>
+        <w:tc>
+          <w:tcPr>
+            <w:tcW w:type="dxa" w:w="2952"/>
+            <w:shd w:val="clear" w:color="auto" w:fill="FFFFFF"/>
+          </w:tcPr>
+          <w:p>
+            <w:r>
+              <w:rPr>
+                <w:sz w:val="20"/>
+              </w:rPr>
+              <w:t>Execution Window</w:t>
+            </w:r>
+          </w:p>
+        </w:tc>
+        <w:tc>
+          <w:tcPr>
+            <w:tcW w:type="dxa" w:w="2952"/>
+            <w:shd w:val="clear" w:color="auto" w:fill="FFFFFF"/>
+          </w:tcPr>
+          <w:p>
+            <w:r>
+              <w:rPr>
+                <w:sz w:val="20"/>
+              </w:rPr>
+              <w:t>fig09 quote staleness curve + "99.6%" callout</w:t>
+            </w:r>
+          </w:p>
+        </w:tc>
+        <w:tc>
+          <w:tcPr>
+            <w:tcW w:type="dxa" w:w="2952"/>
+            <w:shd w:val="clear" w:color="auto" w:fill="FFFFFF"/>
+          </w:tcPr>
+          <w:p>
+            <w:r>
+              <w:rPr>
+                <w:sz w:val="20"/>
+              </w:rPr>
+              <w:t>`figures/fig09_quote_staleness.png`</w:t>
+            </w:r>
+          </w:p>
+        </w:tc>
+      </w:tr>
+      <w:tr>
+        <w:tc>
+          <w:tcPr>
+            <w:tcW w:type="dxa" w:w="2952"/>
+            <w:shd w:val="clear" w:color="auto" w:fill="F2F2F7"/>
+          </w:tcPr>
+          <w:p>
+            <w:r>
+              <w:rPr>
+                <w:sz w:val="20"/>
+              </w:rPr>
+              <w:t>13</w:t>
+            </w:r>
+          </w:p>
+        </w:tc>
+        <w:tc>
+          <w:tcPr>
+            <w:tcW w:type="dxa" w:w="2952"/>
+            <w:shd w:val="clear" w:color="auto" w:fill="F2F2F7"/>
+          </w:tcPr>
+          <w:p>
+            <w:r>
+              <w:rPr>
+                <w:sz w:val="20"/>
+              </w:rPr>
+              <w:t>Close</w:t>
+            </w:r>
+          </w:p>
+        </w:tc>
+        <w:tc>
+          <w:tcPr>
+            <w:tcW w:type="dxa" w:w="2952"/>
+            <w:shd w:val="clear" w:color="auto" w:fill="F2F2F7"/>
+          </w:tcPr>
+          <w:p>
+            <w:r>
+              <w:rPr>
+                <w:sz w:val="20"/>
+              </w:rPr>
+              <w:t>FullGraph.png dark + three-word summary + fig18 radar</w:t>
+            </w:r>
+          </w:p>
+        </w:tc>
+        <w:tc>
+          <w:tcPr>
+            <w:tcW w:type="dxa" w:w="2952"/>
+            <w:shd w:val="clear" w:color="auto" w:fill="F2F2F7"/>
+          </w:tcPr>
+          <w:p>
+            <w:r>
+              <w:rPr>
+                <w:sz w:val="20"/>
+              </w:rPr>
+              <w:t>`figures/FullGraph.png` + `figures/fig18_radar_summary.png`</w:t>
+            </w:r>
+          </w:p>
+        </w:tc>
+      </w:tr>
+    </w:tbl>
+    <w:p/>
     <w:p>
       <w:pPr>
-        <w:pStyle w:val="Spoken"/>
+        <w:pBdr>
+          <w:bottom w:val="single" w:sz="4" w:space="1" w:color="CCCCCC"/>
+        </w:pBdr>
+        <w:spacing w:after="80"/>
       </w:pPr>
-      <w:r>
-        <w:rPr>
-          <w:i/>
-          <w:color w:val="1A1A2E"/>
-        </w:rPr>
-        <w:t>"Thank you."</w:t>
-      </w:r>
-    </w:p>
-    <w:p>
-      <w:pPr>
-        <w:pStyle w:val="Direction"/>
-      </w:pPr>
-      <w:r>
-        <w:rPr>
-          <w:color w:val="555555"/>
-        </w:rPr>
-        <w:t>[DIRECTION: Hold the silence after 'Thank you.' Do not add '...any questions?' Let the room respond.]</w:t>
-      </w:r>
     </w:p>
     <w:p>
       <w:pPr>
@@ -1931,8 +1454,16 @@
         <w:pStyle w:val="Note"/>
       </w:pPr>
       <w:r>
-        <w:t>Lead with the one-line opener every time. Elaborate only if the questioner follows up. Aim for 30–45 seconds per answer.</w:t>
+        <w:t>Lead with the one-line opener every time. Aim for 30–45 seconds per answer.</w:t>
       </w:r>
+    </w:p>
+    <w:p>
+      <w:pPr>
+        <w:pBdr>
+          <w:bottom w:val="single" w:sz="4" w:space="1" w:color="CCCCCC"/>
+        </w:pBdr>
+        <w:spacing w:after="80"/>
+      </w:pPr>
     </w:p>
     <w:p>
       <w:pPr>
@@ -1942,12 +1473,12 @@
         </w:pBdr>
       </w:pPr>
       <w:r>
-        <w:t>Q1 — Why A* and not Bellman-Ford or negative cycle detection?</w:t>
+        <w:t>Q1 — "Why A\ and not Bellman-Ford or negative cycle detection?"</w:t>
       </w:r>
     </w:p>
     <w:p>
       <w:pPr>
-        <w:pStyle w:val="Oneliner"/>
+        <w:pStyle w:val="QAOpener"/>
         <w:shd w:val="clear" w:color="auto" w:fill="E8F5E9"/>
       </w:pPr>
       <w:r>
@@ -1955,7 +1486,7 @@
           <w:b/>
           <w:color w:val="1B5E20"/>
         </w:rPr>
-        <w:t xml:space="preserve">One-liner: </w:t>
+        <w:t xml:space="preserve">One-liner:  </w:t>
       </w:r>
       <w:r>
         <w:rPr>
@@ -1967,11 +1498,19 @@
     </w:p>
     <w:p>
       <w:pPr>
-        <w:pStyle w:val="FullAnswer"/>
+        <w:pStyle w:val="QABody"/>
       </w:pPr>
       <w:r>
-        <w:t>Traditional arbitrage systems use negative cycle detection — they look for closed loops where the product of exchange rates exceeds one. But that framing has two problems for our setting. First, it ignores execution costs entirely: fees, slippage, transfer delays, and exchange reliability are not in that model. Second, it requires a closed loop — returning to your starting asset — which is unnecessary when all assets are dollar-pegged stablecoins. Our open-path formulation is fundamentally different: we are looking for any path that ends with more USD value than we started with, accounting for all real costs. A* with goal-directed early termination is the right tool for that problem. Bellman-Ford, one-hop, and two-hop enumeration all fail in our experiments.</w:t>
+        <w:t>Traditional arbitrage systems use negative cycle detection — they look for closed loops where the product of exchange rates exceeds one. But that framing has two problems for our setting. First, it ignores execution costs entirely: fees, slippage, transfer delays, and exchange reliability are not in that model. Second, it requires a closed loop — returning to your starting asset — which is unnecessary when all assets are dollar-pegged stablecoins. Our open-path formulation is fundamentally different: we are looking for any path that ends with more USD value than we started with, accounting for all real costs. A* with goal-directed early termination is the right tool for that problem. Bellman-Ford, one-hop, and two-hop enumeration all fail in our experiments — they cannot identify a profitable executable path under live market conditions.</w:t>
       </w:r>
+    </w:p>
+    <w:p>
+      <w:pPr>
+        <w:pBdr>
+          <w:bottom w:val="single" w:sz="4" w:space="1" w:color="CCCCCC"/>
+        </w:pBdr>
+        <w:spacing w:after="80"/>
+      </w:pPr>
     </w:p>
     <w:p>
       <w:pPr>
@@ -1981,12 +1520,12 @@
         </w:pBdr>
       </w:pPr>
       <w:r>
-        <w:t>Q2 — Is a 29% reduction in node expansions practically significant in live trading?</w:t>
+        <w:t>Q2 — "Is a 29% reduction in node expansions practically significant in live trading?"</w:t>
       </w:r>
     </w:p>
     <w:p>
       <w:pPr>
-        <w:pStyle w:val="Oneliner"/>
+        <w:pStyle w:val="QAOpener"/>
         <w:shd w:val="clear" w:color="auto" w:fill="E8F5E9"/>
       </w:pPr>
       <w:r>
@@ -1994,7 +1533,7 @@
           <w:b/>
           <w:color w:val="1B5E20"/>
         </w:rPr>
-        <w:t xml:space="preserve">One-liner: </w:t>
+        <w:t xml:space="preserve">One-liner:  </w:t>
       </w:r>
       <w:r>
         <w:rPr>
@@ -2006,11 +1545,19 @@
     </w:p>
     <w:p>
       <w:pPr>
-        <w:pStyle w:val="FullAnswer"/>
+        <w:pStyle w:val="QABody"/>
       </w:pPr>
       <w:r>
-        <w:t>A 29% reduction while matching profit within 1% tells us something important: h₂'s slippage estimate is genuinely informative. It is guiding A* toward the same high-quality routes as Dijkstra, but exploring fewer dead ends along the way. In a real deployment, this translates to lower computational cost at scale — thousands of searches per day — and faster termination in time-sensitive windows.</w:t>
+        <w:t>A 29% reduction while matching profit within 1% tells us something important: h₂'s slippage estimate is genuinely informative. It is guiding A* toward the same high-quality routes as Dijkstra, but exploring fewer dead ends along the way. In a real deployment, this translates to lower computational cost at scale — thousands of searches per day — and faster termination in time-sensitive windows. But more importantly for the research: it validates that domain-specific guidance can improve search efficiency without sacrificing solution quality, which has implications beyond this specific application.</w:t>
       </w:r>
+    </w:p>
+    <w:p>
+      <w:pPr>
+        <w:pBdr>
+          <w:bottom w:val="single" w:sz="4" w:space="1" w:color="CCCCCC"/>
+        </w:pBdr>
+        <w:spacing w:after="80"/>
+      </w:pPr>
     </w:p>
     <w:p>
       <w:pPr>
@@ -2020,12 +1567,12 @@
         </w:pBdr>
       </w:pPr>
       <w:r>
-        <w:t>Q3 — Are your heuristics admissible? Do they guarantee optimal paths?</w:t>
+        <w:t>Q3 — "Are your heuristics admissible? Do they guarantee optimal paths?"</w:t>
       </w:r>
     </w:p>
     <w:p>
       <w:pPr>
-        <w:pStyle w:val="Oneliner"/>
+        <w:pStyle w:val="QAOpener"/>
         <w:shd w:val="clear" w:color="auto" w:fill="E8F5E9"/>
       </w:pPr>
       <w:r>
@@ -2033,7 +1580,7 @@
           <w:b/>
           <w:color w:val="1B5E20"/>
         </w:rPr>
-        <w:t xml:space="preserve">One-liner: </w:t>
+        <w:t xml:space="preserve">One-liner:  </w:t>
       </w:r>
       <w:r>
         <w:rPr>
@@ -2045,11 +1592,19 @@
     </w:p>
     <w:p>
       <w:pPr>
-        <w:pStyle w:val="FullAnswer"/>
+        <w:pStyle w:val="QABody"/>
       </w:pPr>
       <w:r>
         <w:t>Admissibility would require our heuristics to never overestimate the true remaining cost. Because they are domain-specific calibrations tuned to execution risk — not worst-case bounds — they can overestimate, meaning A* may not return the globally optimal path. We accept that trade-off deliberately. In real-time arbitrage, finding a good executable path quickly is more valuable than proving it is optimal. The fact that h₂ matches Dijkstra's profit within 1% across 7,200 instances suggests the practical cost of inadmissibility is negligible in this domain.</w:t>
       </w:r>
+    </w:p>
+    <w:p>
+      <w:pPr>
+        <w:pBdr>
+          <w:bottom w:val="single" w:sz="4" w:space="1" w:color="CCCCCC"/>
+        </w:pBdr>
+        <w:spacing w:after="80"/>
+      </w:pPr>
     </w:p>
     <w:p>
       <w:pPr>
@@ -2059,12 +1614,12 @@
         </w:pBdr>
       </w:pPr>
       <w:r>
-        <w:t>Q4 — What are the main limitations of this work?</w:t>
+        <w:t>Q4 — "What are the main limitations of this work?"</w:t>
       </w:r>
     </w:p>
     <w:p>
       <w:pPr>
-        <w:pStyle w:val="Oneliner"/>
+        <w:pStyle w:val="QAOpener"/>
         <w:shd w:val="clear" w:color="auto" w:fill="E8F5E9"/>
       </w:pPr>
       <w:r>
@@ -2072,7 +1627,7 @@
           <w:b/>
           <w:color w:val="1B5E20"/>
         </w:rPr>
-        <w:t xml:space="preserve">One-liner: </w:t>
+        <w:t xml:space="preserve">One-liner:  </w:t>
       </w:r>
       <w:r>
         <w:rPr>
@@ -2084,11 +1639,19 @@
     </w:p>
     <w:p>
       <w:pPr>
-        <w:pStyle w:val="FullAnswer"/>
+        <w:pStyle w:val="QABody"/>
       </w:pPr>
       <w:r>
-        <w:t>First, this is a CEX-only study — the extension to decentralized exchanges and AMMs is future work. Second, our system is a path planner: it finds routes in simulation but does not place live orders. Bridging the planning-execution gap is a significant open problem. Third, the lambda parameters in our heuristics were tuned empirically on our dataset; transferring them to a different exchange set or asset class would require retuning.</w:t>
+        <w:t>First, this is a CEX-only study — the extension to decentralized exchanges and AMMs is future work. Second, our system is a path planner: it finds routes in simulation but does not place live orders. Bridging the planning-execution gap — handling partial fills, order rejections, and race conditions — is a significant open problem. Third, the lambda parameters in our heuristics were tuned empirically on our dataset; transferring them to a different exchange set or asset class would require retuning. We acknowledge all three in the conclusion.</w:t>
       </w:r>
+    </w:p>
+    <w:p>
+      <w:pPr>
+        <w:pBdr>
+          <w:bottom w:val="single" w:sz="4" w:space="1" w:color="CCCCCC"/>
+        </w:pBdr>
+        <w:spacing w:after="80"/>
+      </w:pPr>
     </w:p>
     <w:p>
       <w:pPr>
@@ -2098,12 +1661,12 @@
         </w:pBdr>
       </w:pPr>
       <w:r>
-        <w:t>Q5 — How do you handle the problem of stale market quotes?</w:t>
+        <w:t>Q5 — "How do you handle the problem of stale market quotes?"</w:t>
       </w:r>
     </w:p>
     <w:p>
       <w:pPr>
-        <w:pStyle w:val="Oneliner"/>
+        <w:pStyle w:val="QAOpener"/>
         <w:shd w:val="clear" w:color="auto" w:fill="E8F5E9"/>
       </w:pPr>
       <w:r>
@@ -2111,7 +1674,7 @@
           <w:b/>
           <w:color w:val="1B5E20"/>
         </w:rPr>
-        <w:t xml:space="preserve">One-liner: </w:t>
+        <w:t xml:space="preserve">One-liner:  </w:t>
       </w:r>
       <w:r>
         <w:rPr>
@@ -2123,11 +1686,19 @@
     </w:p>
     <w:p>
       <w:pPr>
-        <w:pStyle w:val="FullAnswer"/>
+        <w:pStyle w:val="QABody"/>
       </w:pPr>
       <w:r>
-        <w:t>After finding a profitable path, we re-evaluated it using fresh market data at delays of 5, 30, 60, 120, and 300 seconds. Up to 120 seconds, 99.6% of paths remained profitable. Beyond 120 seconds the success rate begins to degrade — which tells us something real about how long these discrepancies persist.</w:t>
+        <w:t>After finding a profitable path, we re-evaluated it using fresh market data at delays of 5, 30, 60, 120, and 300 seconds. Up to 120 seconds, 99.6% of paths remained profitable. Beyond 120 seconds the success rate begins to degrade — which tells us something real about how long these discrepancies persist. For a practitioner, this gives a concrete answer: act within two minutes of path discovery for near-certain profitability.</w:t>
       </w:r>
+    </w:p>
+    <w:p>
+      <w:pPr>
+        <w:pBdr>
+          <w:bottom w:val="single" w:sz="4" w:space="1" w:color="CCCCCC"/>
+        </w:pBdr>
+        <w:spacing w:after="80"/>
+      </w:pPr>
     </w:p>
     <w:p>
       <w:pPr>
@@ -2137,12 +1708,12 @@
         </w:pBdr>
       </w:pPr>
       <w:r>
-        <w:t>Q6 — Your paper shows 56.7% success on the cached graph. But you said every run found a profitable path?</w:t>
+        <w:t>Q6 — "Your paper shows 56.7% success on the cached graph. But you said every run found a profitable path?"</w:t>
       </w:r>
     </w:p>
     <w:p>
       <w:pPr>
-        <w:pStyle w:val="Oneliner"/>
+        <w:pStyle w:val="QAOpener"/>
         <w:shd w:val="clear" w:color="auto" w:fill="E8F5E9"/>
       </w:pPr>
       <w:r>
@@ -2150,7 +1721,7 @@
           <w:b/>
           <w:color w:val="1B5E20"/>
         </w:rPr>
-        <w:t xml:space="preserve">One-liner: </w:t>
+        <w:t xml:space="preserve">One-liner:  </w:t>
       </w:r>
       <w:r>
         <w:rPr>
@@ -2162,11 +1733,19 @@
     </w:p>
     <w:p>
       <w:pPr>
-        <w:pStyle w:val="FullAnswer"/>
+        <w:pStyle w:val="QABody"/>
       </w:pPr>
       <w:r>
-        <w:t>The 56.7% figure is from the cached-graph study: we tested thirty fixed starting nodes, and 17 of them had a profitable path reachable from that specific starting point. The overnight campaign is different: we ran 7,200 searches with varied starting conditions across eight hours of live market data, and in each of those instances, A* found a profitable path. The success rate is 100% because we were not restricted to a fixed set of potentially unprofitable starting nodes.</w:t>
+        <w:t>The 56.7% figure is from the cached-graph study: we tested thirty fixed starting nodes, and 17 of them had a profitable path reachable from that specific starting point. Not every starting node in the network has an arbitrage opportunity — the market may simply not be in a state where a profitable path exists from node X. The overnight campaign is different: we ran 7,200 searches with varied starting conditions across eight hours of live market data, and in each of those 7,200 instances, A* found a profitable path. The success rate in that setting is 100% because we were not restricted to a fixed set of potentially unprofitable starting nodes.</w:t>
       </w:r>
+    </w:p>
+    <w:p>
+      <w:pPr>
+        <w:pBdr>
+          <w:bottom w:val="single" w:sz="4" w:space="1" w:color="CCCCCC"/>
+        </w:pBdr>
+        <w:spacing w:after="80"/>
+      </w:pPr>
     </w:p>
     <w:p>
       <w:pPr>
@@ -2176,12 +1755,12 @@
         </w:pBdr>
       </w:pPr>
       <w:r>
-        <w:t>Q7 — Could a system like this be used for market manipulation?</w:t>
+        <w:t>Q7 — "Could a system like this be used for market manipulation?"</w:t>
       </w:r>
     </w:p>
     <w:p>
       <w:pPr>
-        <w:pStyle w:val="Oneliner"/>
+        <w:pStyle w:val="QAOpener"/>
         <w:shd w:val="clear" w:color="auto" w:fill="E8F5E9"/>
       </w:pPr>
       <w:r>
@@ -2189,7 +1768,7 @@
           <w:b/>
           <w:color w:val="1B5E20"/>
         </w:rPr>
-        <w:t xml:space="preserve">One-liner: </w:t>
+        <w:t xml:space="preserve">One-liner:  </w:t>
       </w:r>
       <w:r>
         <w:rPr>
@@ -2201,11 +1780,19 @@
     </w:p>
     <w:p>
       <w:pPr>
-        <w:pStyle w:val="FullAnswer"/>
+        <w:pStyle w:val="QABody"/>
       </w:pPr>
       <w:r>
-        <w:t>Our system finds naturally occurring price discrepancies between independent exchanges. It does not place orders that move prices in a coordinated way, and the capital scale we test — $1,000 to $100,000 — is orders of magnitude below what would be required to meaningfully influence a market with $300 billion in capitalization. The research is intended as a planning and analysis framework, not a deployment-ready trading system.</w:t>
+        <w:t>Our system finds naturally occurring price discrepancies between independent exchanges. It does not place orders that move prices in a coordinated way, and the capital scale we test — $1,000 to $100,000 — is orders of magnitude below what would be required to meaningfully influence a market with $300 billion in capitalization. Arbitrage is broadly considered a stabilizing force: buying cheap and selling dear drives prices toward convergence. The research is intended as a planning and analysis framework, not a deployment-ready trading system.</w:t>
       </w:r>
+    </w:p>
+    <w:p>
+      <w:pPr>
+        <w:pBdr>
+          <w:bottom w:val="single" w:sz="4" w:space="1" w:color="CCCCCC"/>
+        </w:pBdr>
+        <w:spacing w:after="80"/>
+      </w:pPr>
     </w:p>
     <w:p>
       <w:pPr>
@@ -2225,7 +1812,7 @@
         <w:pStyle w:val="Heading2"/>
       </w:pPr>
       <w:r>
-        <w:t>Timing Reference</w:t>
+        <w:t>Timing Reference (v2 — 13 slides)</w:t>
       </w:r>
     </w:p>
     <w:tbl>
@@ -2243,7 +1830,23 @@
       <w:tr>
         <w:tc>
           <w:tcPr>
-            <w:tcW w:type="dxa" w:w="2880"/>
+            <w:tcW w:type="dxa" w:w="2952"/>
+            <w:shd w:val="clear" w:color="auto" w:fill="CC0633"/>
+          </w:tcPr>
+          <w:p>
+            <w:r>
+              <w:rPr>
+                <w:b/>
+                <w:color w:val="FFFFFF"/>
+                <w:sz w:val="20"/>
+              </w:rPr>
+              <w:t>Slide</w:t>
+            </w:r>
+          </w:p>
+        </w:tc>
+        <w:tc>
+          <w:tcPr>
+            <w:tcW w:type="dxa" w:w="2952"/>
             <w:shd w:val="clear" w:color="auto" w:fill="CC0633"/>
           </w:tcPr>
           <w:p>
@@ -2259,7 +1862,7 @@
         </w:tc>
         <w:tc>
           <w:tcPr>
-            <w:tcW w:type="dxa" w:w="3600"/>
+            <w:tcW w:type="dxa" w:w="2952"/>
             <w:shd w:val="clear" w:color="auto" w:fill="CC0633"/>
           </w:tcPr>
           <w:p>
@@ -2269,13 +1872,13 @@
                 <w:color w:val="FFFFFF"/>
                 <w:sz w:val="20"/>
               </w:rPr>
-              <w:t>Slide</w:t>
+              <w:t>Target end</w:t>
             </w:r>
           </w:p>
         </w:tc>
         <w:tc>
           <w:tcPr>
-            <w:tcW w:type="dxa" w:w="1728"/>
+            <w:tcW w:type="dxa" w:w="2952"/>
             <w:shd w:val="clear" w:color="auto" w:fill="CC0633"/>
           </w:tcPr>
           <w:p>
@@ -2285,23 +1888,7 @@
                 <w:color w:val="FFFFFF"/>
                 <w:sz w:val="20"/>
               </w:rPr>
-              <w:t>Target End</w:t>
-            </w:r>
-          </w:p>
-        </w:tc>
-        <w:tc>
-          <w:tcPr>
-            <w:tcW w:type="dxa" w:w="1728"/>
-            <w:shd w:val="clear" w:color="auto" w:fill="CC0633"/>
-          </w:tcPr>
-          <w:p>
-            <w:r>
-              <w:rPr>
-                <w:b/>
-                <w:color w:val="FFFFFF"/>
-                <w:sz w:val="20"/>
-              </w:rPr>
-              <w:t>Running Total</w:t>
+              <w:t>Running total</w:t>
             </w:r>
           </w:p>
         </w:tc>
@@ -2309,7 +1896,7 @@
       <w:tr>
         <w:tc>
           <w:tcPr>
-            <w:tcW w:type="dxa" w:w="2880"/>
+            <w:tcW w:type="dxa" w:w="2952"/>
             <w:shd w:val="clear" w:color="auto" w:fill="F2F2F7"/>
           </w:tcPr>
           <w:p>
@@ -2317,13 +1904,13 @@
               <w:rPr>
                 <w:sz w:val="20"/>
               </w:rPr>
-              <w:t>Hook</w:t>
+              <w:t>1</w:t>
             </w:r>
           </w:p>
         </w:tc>
         <w:tc>
           <w:tcPr>
-            <w:tcW w:type="dxa" w:w="3600"/>
+            <w:tcW w:type="dxa" w:w="2952"/>
             <w:shd w:val="clear" w:color="auto" w:fill="F2F2F7"/>
           </w:tcPr>
           <w:p>
@@ -2331,13 +1918,13 @@
               <w:rPr>
                 <w:sz w:val="20"/>
               </w:rPr>
-              <w:t>Title</w:t>
+              <w:t>Hook — Title</w:t>
             </w:r>
           </w:p>
         </w:tc>
         <w:tc>
           <w:tcPr>
-            <w:tcW w:type="dxa" w:w="1728"/>
+            <w:tcW w:type="dxa" w:w="2952"/>
             <w:shd w:val="clear" w:color="auto" w:fill="F2F2F7"/>
           </w:tcPr>
           <w:p>
@@ -2345,13 +1932,13 @@
               <w:rPr>
                 <w:sz w:val="20"/>
               </w:rPr>
-              <w:t>0:55</w:t>
+              <w:t>0:50</w:t>
             </w:r>
           </w:p>
         </w:tc>
         <w:tc>
           <w:tcPr>
-            <w:tcW w:type="dxa" w:w="1728"/>
+            <w:tcW w:type="dxa" w:w="2952"/>
             <w:shd w:val="clear" w:color="auto" w:fill="F2F2F7"/>
           </w:tcPr>
           <w:p>
@@ -2359,7 +1946,7 @@
               <w:rPr>
                 <w:sz w:val="20"/>
               </w:rPr>
-              <w:t>0:55</w:t>
+              <w:t>0:50</w:t>
             </w:r>
           </w:p>
         </w:tc>
@@ -2367,7 +1954,21 @@
       <w:tr>
         <w:tc>
           <w:tcPr>
-            <w:tcW w:type="dxa" w:w="2880"/>
+            <w:tcW w:type="dxa" w:w="2952"/>
+            <w:shd w:val="clear" w:color="auto" w:fill="FFFFFF"/>
+          </w:tcPr>
+          <w:p>
+            <w:r>
+              <w:rPr>
+                <w:sz w:val="20"/>
+              </w:rPr>
+              <w:t>2</w:t>
+            </w:r>
+          </w:p>
+        </w:tc>
+        <w:tc>
+          <w:tcPr>
+            <w:tcW w:type="dxa" w:w="2952"/>
             <w:shd w:val="clear" w:color="auto" w:fill="FFFFFF"/>
           </w:tcPr>
           <w:p>
@@ -2381,7 +1982,7 @@
         </w:tc>
         <w:tc>
           <w:tcPr>
-            <w:tcW w:type="dxa" w:w="3600"/>
+            <w:tcW w:type="dxa" w:w="2952"/>
             <w:shd w:val="clear" w:color="auto" w:fill="FFFFFF"/>
           </w:tcPr>
           <w:p>
@@ -2389,13 +1990,13 @@
               <w:rPr>
                 <w:sz w:val="20"/>
               </w:rPr>
-              <w:t>$33T Bar Chart</w:t>
+              <w:t>1:35</w:t>
             </w:r>
           </w:p>
         </w:tc>
         <w:tc>
           <w:tcPr>
-            <w:tcW w:type="dxa" w:w="1728"/>
+            <w:tcW w:type="dxa" w:w="2952"/>
             <w:shd w:val="clear" w:color="auto" w:fill="FFFFFF"/>
           </w:tcPr>
           <w:p>
@@ -2403,13 +2004,73 @@
               <w:rPr>
                 <w:sz w:val="20"/>
               </w:rPr>
-              <w:t>1:45</w:t>
+              <w:t>1:35</w:t>
+            </w:r>
+          </w:p>
+        </w:tc>
+      </w:tr>
+      <w:tr>
+        <w:tc>
+          <w:tcPr>
+            <w:tcW w:type="dxa" w:w="2952"/>
+            <w:shd w:val="clear" w:color="auto" w:fill="F2F2F7"/>
+          </w:tcPr>
+          <w:p>
+            <w:r>
+              <w:rPr>
+                <w:sz w:val="20"/>
+              </w:rPr>
+              <w:t>3</w:t>
             </w:r>
           </w:p>
         </w:tc>
         <w:tc>
           <w:tcPr>
-            <w:tcW w:type="dxa" w:w="1728"/>
+            <w:tcW w:type="dxa" w:w="2952"/>
+            <w:shd w:val="clear" w:color="auto" w:fill="F2F2F7"/>
+          </w:tcPr>
+          <w:p>
+            <w:r>
+              <w:rPr>
+                <w:sz w:val="20"/>
+              </w:rPr>
+              <w:t>Price Fragmentation</w:t>
+            </w:r>
+          </w:p>
+        </w:tc>
+        <w:tc>
+          <w:tcPr>
+            <w:tcW w:type="dxa" w:w="2952"/>
+            <w:shd w:val="clear" w:color="auto" w:fill="F2F2F7"/>
+          </w:tcPr>
+          <w:p>
+            <w:r>
+              <w:rPr>
+                <w:sz w:val="20"/>
+              </w:rPr>
+              <w:t>2:00</w:t>
+            </w:r>
+          </w:p>
+        </w:tc>
+        <w:tc>
+          <w:tcPr>
+            <w:tcW w:type="dxa" w:w="2952"/>
+            <w:shd w:val="clear" w:color="auto" w:fill="F2F2F7"/>
+          </w:tcPr>
+          <w:p>
+            <w:r>
+              <w:rPr>
+                <w:sz w:val="20"/>
+              </w:rPr>
+              <w:t>2:00</w:t>
+            </w:r>
+          </w:p>
+        </w:tc>
+      </w:tr>
+      <w:tr>
+        <w:tc>
+          <w:tcPr>
+            <w:tcW w:type="dxa" w:w="2952"/>
             <w:shd w:val="clear" w:color="auto" w:fill="FFFFFF"/>
           </w:tcPr>
           <w:p>
@@ -2417,7 +2078,49 @@
               <w:rPr>
                 <w:sz w:val="20"/>
               </w:rPr>
-              <w:t>1:45</w:t>
+              <w:t>4</w:t>
+            </w:r>
+          </w:p>
+        </w:tc>
+        <w:tc>
+          <w:tcPr>
+            <w:tcW w:type="dxa" w:w="2952"/>
+            <w:shd w:val="clear" w:color="auto" w:fill="FFFFFF"/>
+          </w:tcPr>
+          <w:p>
+            <w:r>
+              <w:rPr>
+                <w:sz w:val="20"/>
+              </w:rPr>
+              <w:t>Execution Barriers</w:t>
+            </w:r>
+          </w:p>
+        </w:tc>
+        <w:tc>
+          <w:tcPr>
+            <w:tcW w:type="dxa" w:w="2952"/>
+            <w:shd w:val="clear" w:color="auto" w:fill="FFFFFF"/>
+          </w:tcPr>
+          <w:p>
+            <w:r>
+              <w:rPr>
+                <w:sz w:val="20"/>
+              </w:rPr>
+              <w:t>2:50</w:t>
+            </w:r>
+          </w:p>
+        </w:tc>
+        <w:tc>
+          <w:tcPr>
+            <w:tcW w:type="dxa" w:w="2952"/>
+            <w:shd w:val="clear" w:color="auto" w:fill="FFFFFF"/>
+          </w:tcPr>
+          <w:p>
+            <w:r>
+              <w:rPr>
+                <w:sz w:val="20"/>
+              </w:rPr>
+              <w:t>2:50</w:t>
             </w:r>
           </w:p>
         </w:tc>
@@ -2425,7 +2128,7 @@
       <w:tr>
         <w:tc>
           <w:tcPr>
-            <w:tcW w:type="dxa" w:w="2880"/>
+            <w:tcW w:type="dxa" w:w="2952"/>
             <w:shd w:val="clear" w:color="auto" w:fill="F2F2F7"/>
           </w:tcPr>
           <w:p>
@@ -2433,13 +2136,13 @@
               <w:rPr>
                 <w:sz w:val="20"/>
               </w:rPr>
-              <w:t>The Problem</w:t>
+              <w:t>5</w:t>
             </w:r>
           </w:p>
         </w:tc>
         <w:tc>
           <w:tcPr>
-            <w:tcW w:type="dxa" w:w="3600"/>
+            <w:tcW w:type="dxa" w:w="2952"/>
             <w:shd w:val="clear" w:color="auto" w:fill="F2F2F7"/>
           </w:tcPr>
           <w:p>
@@ -2447,13 +2150,13 @@
               <w:rPr>
                 <w:sz w:val="20"/>
               </w:rPr>
-              <w:t>Split Warning Icons</w:t>
+              <w:t>Baselines Fail</w:t>
             </w:r>
           </w:p>
         </w:tc>
         <w:tc>
           <w:tcPr>
-            <w:tcW w:type="dxa" w:w="1728"/>
+            <w:tcW w:type="dxa" w:w="2952"/>
             <w:shd w:val="clear" w:color="auto" w:fill="F2F2F7"/>
           </w:tcPr>
           <w:p>
@@ -2461,13 +2164,13 @@
               <w:rPr>
                 <w:sz w:val="20"/>
               </w:rPr>
-              <w:t>2:55</w:t>
+              <w:t>3:10</w:t>
             </w:r>
           </w:p>
         </w:tc>
         <w:tc>
           <w:tcPr>
-            <w:tcW w:type="dxa" w:w="1728"/>
+            <w:tcW w:type="dxa" w:w="2952"/>
             <w:shd w:val="clear" w:color="auto" w:fill="F2F2F7"/>
           </w:tcPr>
           <w:p>
@@ -2475,7 +2178,7 @@
               <w:rPr>
                 <w:sz w:val="20"/>
               </w:rPr>
-              <w:t>2:55</w:t>
+              <w:t>3:10</w:t>
             </w:r>
           </w:p>
         </w:tc>
@@ -2483,7 +2186,7 @@
       <w:tr>
         <w:tc>
           <w:tcPr>
-            <w:tcW w:type="dxa" w:w="2880"/>
+            <w:tcW w:type="dxa" w:w="2952"/>
             <w:shd w:val="clear" w:color="auto" w:fill="FFFFFF"/>
           </w:tcPr>
           <w:p>
@@ -2491,13 +2194,13 @@
               <w:rPr>
                 <w:sz w:val="20"/>
               </w:rPr>
-              <w:t>The Graph</w:t>
+              <w:t>6</w:t>
             </w:r>
           </w:p>
         </w:tc>
         <w:tc>
           <w:tcPr>
-            <w:tcW w:type="dxa" w:w="3600"/>
+            <w:tcW w:type="dxa" w:w="2952"/>
             <w:shd w:val="clear" w:color="auto" w:fill="FFFFFF"/>
           </w:tcPr>
           <w:p>
@@ -2505,13 +2208,13 @@
               <w:rPr>
                 <w:sz w:val="20"/>
               </w:rPr>
-              <w:t>FullGraph</w:t>
+              <w:t>The Dataset</w:t>
             </w:r>
           </w:p>
         </w:tc>
         <w:tc>
           <w:tcPr>
-            <w:tcW w:type="dxa" w:w="1728"/>
+            <w:tcW w:type="dxa" w:w="2952"/>
             <w:shd w:val="clear" w:color="auto" w:fill="FFFFFF"/>
           </w:tcPr>
           <w:p>
@@ -2525,7 +2228,7 @@
         </w:tc>
         <w:tc>
           <w:tcPr>
-            <w:tcW w:type="dxa" w:w="1728"/>
+            <w:tcW w:type="dxa" w:w="2952"/>
             <w:shd w:val="clear" w:color="auto" w:fill="FFFFFF"/>
           </w:tcPr>
           <w:p>
@@ -2541,7 +2244,21 @@
       <w:tr>
         <w:tc>
           <w:tcPr>
-            <w:tcW w:type="dxa" w:w="2880"/>
+            <w:tcW w:type="dxa" w:w="2952"/>
+            <w:shd w:val="clear" w:color="auto" w:fill="F2F2F7"/>
+          </w:tcPr>
+          <w:p>
+            <w:r>
+              <w:rPr>
+                <w:sz w:val="20"/>
+              </w:rPr>
+              <w:t>7</w:t>
+            </w:r>
+          </w:p>
+        </w:tc>
+        <w:tc>
+          <w:tcPr>
+            <w:tcW w:type="dxa" w:w="2952"/>
             <w:shd w:val="clear" w:color="auto" w:fill="F2F2F7"/>
           </w:tcPr>
           <w:p>
@@ -2555,7 +2272,7 @@
         </w:tc>
         <w:tc>
           <w:tcPr>
-            <w:tcW w:type="dxa" w:w="3600"/>
+            <w:tcW w:type="dxa" w:w="2952"/>
             <w:shd w:val="clear" w:color="auto" w:fill="F2F2F7"/>
           </w:tcPr>
           <w:p>
@@ -2563,13 +2280,13 @@
               <w:rPr>
                 <w:sz w:val="20"/>
               </w:rPr>
-              <w:t>Side-by-Side Animation</w:t>
+              <w:t>4:20</w:t>
             </w:r>
           </w:p>
         </w:tc>
         <w:tc>
           <w:tcPr>
-            <w:tcW w:type="dxa" w:w="1728"/>
+            <w:tcW w:type="dxa" w:w="2952"/>
             <w:shd w:val="clear" w:color="auto" w:fill="F2F2F7"/>
           </w:tcPr>
           <w:p>
@@ -2577,13 +2294,73 @@
               <w:rPr>
                 <w:sz w:val="20"/>
               </w:rPr>
-              <w:t>4:30</w:t>
+              <w:t>4:20</w:t>
+            </w:r>
+          </w:p>
+        </w:tc>
+      </w:tr>
+      <w:tr>
+        <w:tc>
+          <w:tcPr>
+            <w:tcW w:type="dxa" w:w="2952"/>
+            <w:shd w:val="clear" w:color="auto" w:fill="FFFFFF"/>
+          </w:tcPr>
+          <w:p>
+            <w:r>
+              <w:rPr>
+                <w:sz w:val="20"/>
+              </w:rPr>
+              <w:t>8</w:t>
             </w:r>
           </w:p>
         </w:tc>
         <w:tc>
           <w:tcPr>
-            <w:tcW w:type="dxa" w:w="1728"/>
+            <w:tcW w:type="dxa" w:w="2952"/>
+            <w:shd w:val="clear" w:color="auto" w:fill="FFFFFF"/>
+          </w:tcPr>
+          <w:p>
+            <w:r>
+              <w:rPr>
+                <w:sz w:val="20"/>
+              </w:rPr>
+              <w:t>Three Heuristics</w:t>
+            </w:r>
+          </w:p>
+        </w:tc>
+        <w:tc>
+          <w:tcPr>
+            <w:tcW w:type="dxa" w:w="2952"/>
+            <w:shd w:val="clear" w:color="auto" w:fill="FFFFFF"/>
+          </w:tcPr>
+          <w:p>
+            <w:r>
+              <w:rPr>
+                <w:sz w:val="20"/>
+              </w:rPr>
+              <w:t>5:10</w:t>
+            </w:r>
+          </w:p>
+        </w:tc>
+        <w:tc>
+          <w:tcPr>
+            <w:tcW w:type="dxa" w:w="2952"/>
+            <w:shd w:val="clear" w:color="auto" w:fill="FFFFFF"/>
+          </w:tcPr>
+          <w:p>
+            <w:r>
+              <w:rPr>
+                <w:sz w:val="20"/>
+              </w:rPr>
+              <w:t>5:10</w:t>
+            </w:r>
+          </w:p>
+        </w:tc>
+      </w:tr>
+      <w:tr>
+        <w:tc>
+          <w:tcPr>
+            <w:tcW w:type="dxa" w:w="2952"/>
             <w:shd w:val="clear" w:color="auto" w:fill="F2F2F7"/>
           </w:tcPr>
           <w:p>
@@ -2591,7 +2368,49 @@
               <w:rPr>
                 <w:sz w:val="20"/>
               </w:rPr>
-              <w:t>4:30</w:t>
+              <w:t>9</w:t>
+            </w:r>
+          </w:p>
+        </w:tc>
+        <w:tc>
+          <w:tcPr>
+            <w:tcW w:type="dxa" w:w="2952"/>
+            <w:shd w:val="clear" w:color="auto" w:fill="F2F2F7"/>
+          </w:tcPr>
+          <w:p>
+            <w:r>
+              <w:rPr>
+                <w:sz w:val="20"/>
+              </w:rPr>
+              <w:t>Key Result (−29%)</w:t>
+            </w:r>
+          </w:p>
+        </w:tc>
+        <w:tc>
+          <w:tcPr>
+            <w:tcW w:type="dxa" w:w="2952"/>
+            <w:shd w:val="clear" w:color="auto" w:fill="F2F2F7"/>
+          </w:tcPr>
+          <w:p>
+            <w:r>
+              <w:rPr>
+                <w:sz w:val="20"/>
+              </w:rPr>
+              <w:t>5:40</w:t>
+            </w:r>
+          </w:p>
+        </w:tc>
+        <w:tc>
+          <w:tcPr>
+            <w:tcW w:type="dxa" w:w="2952"/>
+            <w:shd w:val="clear" w:color="auto" w:fill="F2F2F7"/>
+          </w:tcPr>
+          <w:p>
+            <w:r>
+              <w:rPr>
+                <w:sz w:val="20"/>
+              </w:rPr>
+              <w:t>5:40</w:t>
             </w:r>
           </w:p>
         </w:tc>
@@ -2599,7 +2418,7 @@
       <w:tr>
         <w:tc>
           <w:tcPr>
-            <w:tcW w:type="dxa" w:w="2880"/>
+            <w:tcW w:type="dxa" w:w="2952"/>
             <w:shd w:val="clear" w:color="auto" w:fill="FFFFFF"/>
           </w:tcPr>
           <w:p>
@@ -2607,13 +2426,13 @@
               <w:rPr>
                 <w:sz w:val="20"/>
               </w:rPr>
-              <w:t>Heuristics</w:t>
+              <w:t>10</w:t>
             </w:r>
           </w:p>
         </w:tc>
         <w:tc>
           <w:tcPr>
-            <w:tcW w:type="dxa" w:w="3600"/>
+            <w:tcW w:type="dxa" w:w="2952"/>
             <w:shd w:val="clear" w:color="auto" w:fill="FFFFFF"/>
           </w:tcPr>
           <w:p>
@@ -2621,13 +2440,13 @@
               <w:rPr>
                 <w:sz w:val="20"/>
               </w:rPr>
-              <w:t>Three Panels</w:t>
+              <w:t>Profit Quality</w:t>
             </w:r>
           </w:p>
         </w:tc>
         <w:tc>
           <w:tcPr>
-            <w:tcW w:type="dxa" w:w="1728"/>
+            <w:tcW w:type="dxa" w:w="2952"/>
             <w:shd w:val="clear" w:color="auto" w:fill="FFFFFF"/>
           </w:tcPr>
           <w:p>
@@ -2635,13 +2454,13 @@
               <w:rPr>
                 <w:sz w:val="20"/>
               </w:rPr>
-              <w:t>5:25</w:t>
+              <w:t>6:00</w:t>
             </w:r>
           </w:p>
         </w:tc>
         <w:tc>
           <w:tcPr>
-            <w:tcW w:type="dxa" w:w="1728"/>
+            <w:tcW w:type="dxa" w:w="2952"/>
             <w:shd w:val="clear" w:color="auto" w:fill="FFFFFF"/>
           </w:tcPr>
           <w:p>
@@ -2649,7 +2468,7 @@
               <w:rPr>
                 <w:sz w:val="20"/>
               </w:rPr>
-              <w:t>5:25</w:t>
+              <w:t>6:00</w:t>
             </w:r>
           </w:p>
         </w:tc>
@@ -2657,7 +2476,7 @@
       <w:tr>
         <w:tc>
           <w:tcPr>
-            <w:tcW w:type="dxa" w:w="2880"/>
+            <w:tcW w:type="dxa" w:w="2952"/>
             <w:shd w:val="clear" w:color="auto" w:fill="F2F2F7"/>
           </w:tcPr>
           <w:p>
@@ -2665,13 +2484,13 @@
               <w:rPr>
                 <w:sz w:val="20"/>
               </w:rPr>
-              <w:t>Result</w:t>
+              <w:t>11</w:t>
             </w:r>
           </w:p>
         </w:tc>
         <w:tc>
           <w:tcPr>
-            <w:tcW w:type="dxa" w:w="3600"/>
+            <w:tcW w:type="dxa" w:w="2952"/>
             <w:shd w:val="clear" w:color="auto" w:fill="F2F2F7"/>
           </w:tcPr>
           <w:p>
@@ -2679,13 +2498,13 @@
               <w:rPr>
                 <w:sz w:val="20"/>
               </w:rPr>
-              <w:t>Bar Chart + Path</w:t>
+              <w:t>Overnight Campaign</w:t>
             </w:r>
           </w:p>
         </w:tc>
         <w:tc>
           <w:tcPr>
-            <w:tcW w:type="dxa" w:w="1728"/>
+            <w:tcW w:type="dxa" w:w="2952"/>
             <w:shd w:val="clear" w:color="auto" w:fill="F2F2F7"/>
           </w:tcPr>
           <w:p>
@@ -2693,13 +2512,13 @@
               <w:rPr>
                 <w:sz w:val="20"/>
               </w:rPr>
-              <w:t>6:20</w:t>
+              <w:t>6:22</w:t>
             </w:r>
           </w:p>
         </w:tc>
         <w:tc>
           <w:tcPr>
-            <w:tcW w:type="dxa" w:w="1728"/>
+            <w:tcW w:type="dxa" w:w="2952"/>
             <w:shd w:val="clear" w:color="auto" w:fill="F2F2F7"/>
           </w:tcPr>
           <w:p>
@@ -2707,7 +2526,7 @@
               <w:rPr>
                 <w:sz w:val="20"/>
               </w:rPr>
-              <w:t>6:20</w:t>
+              <w:t>6:22</w:t>
             </w:r>
           </w:p>
         </w:tc>
@@ -2715,7 +2534,7 @@
       <w:tr>
         <w:tc>
           <w:tcPr>
-            <w:tcW w:type="dxa" w:w="2880"/>
+            <w:tcW w:type="dxa" w:w="2952"/>
             <w:shd w:val="clear" w:color="auto" w:fill="FFFFFF"/>
           </w:tcPr>
           <w:p>
@@ -2723,13 +2542,13 @@
               <w:rPr>
                 <w:sz w:val="20"/>
               </w:rPr>
-              <w:t>Impact</w:t>
+              <w:t>12</w:t>
             </w:r>
           </w:p>
         </w:tc>
         <w:tc>
           <w:tcPr>
-            <w:tcW w:type="dxa" w:w="3600"/>
+            <w:tcW w:type="dxa" w:w="2952"/>
             <w:shd w:val="clear" w:color="auto" w:fill="FFFFFF"/>
           </w:tcPr>
           <w:p>
@@ -2737,13 +2556,13 @@
               <w:rPr>
                 <w:sz w:val="20"/>
               </w:rPr>
-              <w:t>World Map + Divergence</w:t>
+              <w:t>Execution Window</w:t>
             </w:r>
           </w:p>
         </w:tc>
         <w:tc>
           <w:tcPr>
-            <w:tcW w:type="dxa" w:w="1728"/>
+            <w:tcW w:type="dxa" w:w="2952"/>
             <w:shd w:val="clear" w:color="auto" w:fill="FFFFFF"/>
           </w:tcPr>
           <w:p>
@@ -2751,13 +2570,13 @@
               <w:rPr>
                 <w:sz w:val="20"/>
               </w:rPr>
-              <w:t>7:25</w:t>
+              <w:t>6:38</w:t>
             </w:r>
           </w:p>
         </w:tc>
         <w:tc>
           <w:tcPr>
-            <w:tcW w:type="dxa" w:w="1728"/>
+            <w:tcW w:type="dxa" w:w="2952"/>
             <w:shd w:val="clear" w:color="auto" w:fill="FFFFFF"/>
           </w:tcPr>
           <w:p>
@@ -2765,7 +2584,7 @@
               <w:rPr>
                 <w:sz w:val="20"/>
               </w:rPr>
-              <w:t>7:25</w:t>
+              <w:t>6:38</w:t>
             </w:r>
           </w:p>
         </w:tc>
@@ -2773,7 +2592,7 @@
       <w:tr>
         <w:tc>
           <w:tcPr>
-            <w:tcW w:type="dxa" w:w="2880"/>
+            <w:tcW w:type="dxa" w:w="2952"/>
             <w:shd w:val="clear" w:color="auto" w:fill="F2F2F7"/>
           </w:tcPr>
           <w:p>
@@ -2781,13 +2600,13 @@
               <w:rPr>
                 <w:sz w:val="20"/>
               </w:rPr>
-              <w:t>Close</w:t>
+              <w:t>13</w:t>
             </w:r>
           </w:p>
         </w:tc>
         <w:tc>
           <w:tcPr>
-            <w:tcW w:type="dxa" w:w="3600"/>
+            <w:tcW w:type="dxa" w:w="2952"/>
             <w:shd w:val="clear" w:color="auto" w:fill="F2F2F7"/>
           </w:tcPr>
           <w:p>
@@ -2795,13 +2614,13 @@
               <w:rPr>
                 <w:sz w:val="20"/>
               </w:rPr>
-              <w:t>FullGraph + Glowing Path</w:t>
+              <w:t>Why It Matters + Close</w:t>
             </w:r>
           </w:p>
         </w:tc>
         <w:tc>
           <w:tcPr>
-            <w:tcW w:type="dxa" w:w="1728"/>
+            <w:tcW w:type="dxa" w:w="2952"/>
             <w:shd w:val="clear" w:color="auto" w:fill="F2F2F7"/>
           </w:tcPr>
           <w:p>
@@ -2815,7 +2634,7 @@
         </w:tc>
         <w:tc>
           <w:tcPr>
-            <w:tcW w:type="dxa" w:w="1728"/>
+            <w:tcW w:type="dxa" w:w="2952"/>
             <w:shd w:val="clear" w:color="auto" w:fill="F2F2F7"/>
           </w:tcPr>
           <w:p>
@@ -2832,12 +2651,366 @@
     <w:p/>
     <w:p>
       <w:pPr>
-        <w:pStyle w:val="Note"/>
+        <w:pBdr>
+          <w:bottom w:val="single" w:sz="4" w:space="1" w:color="CCCCCC"/>
+        </w:pBdr>
+        <w:spacing w:after="80"/>
+      </w:pPr>
+    </w:p>
+    <w:p>
+      <w:pPr>
+        <w:pStyle w:val="Heading2"/>
       </w:pPr>
       <w:r>
-        <w:t>Practice tip: Record yourself once with a timer. Target 7:45–8:10. The [PAUSE] and [DIRECTION] markers consume approximately 50 seconds — do not skip them, they are not dead time.</w:t>
+        <w:t>What Changed Script → v3 (alignment with slides_v2.pptx)</w:t>
       </w:r>
     </w:p>
+    <w:tbl>
+      <w:tblPr>
+        <w:tblStyle w:val="TableGrid"/>
+        <w:tblW w:type="auto" w:w="0"/>
+        <w:tblLook w:firstColumn="1" w:firstRow="1" w:lastColumn="0" w:lastRow="0" w:noHBand="0" w:noVBand="1" w:val="04A0"/>
+      </w:tblPr>
+      <w:tblGrid>
+        <w:gridCol w:w="3816"/>
+        <w:gridCol w:w="3816"/>
+      </w:tblGrid>
+      <w:tr>
+        <w:tc>
+          <w:tcPr>
+            <w:tcW w:type="dxa" w:w="5904"/>
+            <w:shd w:val="clear" w:color="auto" w:fill="CC0633"/>
+          </w:tcPr>
+          <w:p>
+            <w:r>
+              <w:rPr>
+                <w:b/>
+                <w:color w:val="FFFFFF"/>
+                <w:sz w:val="20"/>
+              </w:rPr>
+              <w:t>Change</w:t>
+            </w:r>
+          </w:p>
+        </w:tc>
+        <w:tc>
+          <w:tcPr>
+            <w:tcW w:type="dxa" w:w="5904"/>
+            <w:shd w:val="clear" w:color="auto" w:fill="CC0633"/>
+          </w:tcPr>
+          <w:p>
+            <w:r>
+              <w:rPr>
+                <w:b/>
+                <w:color w:val="FFFFFF"/>
+                <w:sz w:val="20"/>
+              </w:rPr>
+              <w:t>Reason</w:t>
+            </w:r>
+          </w:p>
+        </w:tc>
+      </w:tr>
+      <w:tr>
+        <w:tc>
+          <w:tcPr>
+            <w:tcW w:type="dxa" w:w="5904"/>
+            <w:shd w:val="clear" w:color="auto" w:fill="F2F2F7"/>
+          </w:tcPr>
+          <w:p>
+            <w:r>
+              <w:rPr>
+                <w:sz w:val="20"/>
+              </w:rPr>
+              <w:t>Added S3 dialogue (Price Fragmentation)</w:t>
+            </w:r>
+          </w:p>
+        </w:tc>
+        <w:tc>
+          <w:tcPr>
+            <w:tcW w:type="dxa" w:w="5904"/>
+            <w:shd w:val="clear" w:color="auto" w:fill="F2F2F7"/>
+          </w:tcPr>
+          <w:p>
+            <w:r>
+              <w:rPr>
+                <w:sz w:val="20"/>
+              </w:rPr>
+              <w:t>New slide in v2 had no script words</w:t>
+            </w:r>
+          </w:p>
+        </w:tc>
+      </w:tr>
+      <w:tr>
+        <w:tc>
+          <w:tcPr>
+            <w:tcW w:type="dxa" w:w="5904"/>
+            <w:shd w:val="clear" w:color="auto" w:fill="FFFFFF"/>
+          </w:tcPr>
+          <w:p>
+            <w:r>
+              <w:rPr>
+                <w:sz w:val="20"/>
+              </w:rPr>
+              <w:t>Added S5 dialogue (Baselines Fail)</w:t>
+            </w:r>
+          </w:p>
+        </w:tc>
+        <w:tc>
+          <w:tcPr>
+            <w:tcW w:type="dxa" w:w="5904"/>
+            <w:shd w:val="clear" w:color="auto" w:fill="FFFFFF"/>
+          </w:tcPr>
+          <w:p>
+            <w:r>
+              <w:rPr>
+                <w:sz w:val="20"/>
+              </w:rPr>
+              <w:t>New slide in v2 had no script words</w:t>
+            </w:r>
+          </w:p>
+        </w:tc>
+      </w:tr>
+      <w:tr>
+        <w:tc>
+          <w:tcPr>
+            <w:tcW w:type="dxa" w:w="5904"/>
+            <w:shd w:val="clear" w:color="auto" w:fill="F2F2F7"/>
+          </w:tcPr>
+          <w:p>
+            <w:r>
+              <w:rPr>
+                <w:sz w:val="20"/>
+              </w:rPr>
+              <w:t>Split old Slide 7 Result → S9 + S10 + S11 + S12</w:t>
+            </w:r>
+          </w:p>
+        </w:tc>
+        <w:tc>
+          <w:tcPr>
+            <w:tcW w:type="dxa" w:w="5904"/>
+            <w:shd w:val="clear" w:color="auto" w:fill="F2F2F7"/>
+          </w:tcPr>
+          <w:p>
+            <w:r>
+              <w:rPr>
+                <w:sz w:val="20"/>
+              </w:rPr>
+              <w:t>Old slide had 4 distinct data points crammed into one</w:t>
+            </w:r>
+          </w:p>
+        </w:tc>
+      </w:tr>
+      <w:tr>
+        <w:tc>
+          <w:tcPr>
+            <w:tcW w:type="dxa" w:w="5904"/>
+            <w:shd w:val="clear" w:color="auto" w:fill="FFFFFF"/>
+          </w:tcPr>
+          <w:p>
+            <w:r>
+              <w:rPr>
+                <w:sz w:val="20"/>
+              </w:rPr>
+              <w:t>Removed standalone Impact slide</w:t>
+            </w:r>
+          </w:p>
+        </w:tc>
+        <w:tc>
+          <w:tcPr>
+            <w:tcW w:type="dxa" w:w="5904"/>
+            <w:shd w:val="clear" w:color="auto" w:fill="FFFFFF"/>
+          </w:tcPr>
+          <w:p>
+            <w:r>
+              <w:rPr>
+                <w:sz w:val="20"/>
+              </w:rPr>
+              <w:t>Content folded into S13 Close (Impact + callback combined)</w:t>
+            </w:r>
+          </w:p>
+        </w:tc>
+      </w:tr>
+      <w:tr>
+        <w:tc>
+          <w:tcPr>
+            <w:tcW w:type="dxa" w:w="5904"/>
+            <w:shd w:val="clear" w:color="auto" w:fill="F2F2F7"/>
+          </w:tcPr>
+          <w:p>
+            <w:r>
+              <w:rPr>
+                <w:sz w:val="20"/>
+              </w:rPr>
+              <w:t>Added S10 dialogue (Profit Quality, 20s)</w:t>
+            </w:r>
+          </w:p>
+        </w:tc>
+        <w:tc>
+          <w:tcPr>
+            <w:tcW w:type="dxa" w:w="5904"/>
+            <w:shd w:val="clear" w:color="auto" w:fill="F2F2F7"/>
+          </w:tcPr>
+          <w:p>
+            <w:r>
+              <w:rPr>
+                <w:sz w:val="20"/>
+              </w:rPr>
+              <w:t>fig03/fig02 added in v2 but unscripted</w:t>
+            </w:r>
+          </w:p>
+        </w:tc>
+      </w:tr>
+      <w:tr>
+        <w:tc>
+          <w:tcPr>
+            <w:tcW w:type="dxa" w:w="5904"/>
+            <w:shd w:val="clear" w:color="auto" w:fill="FFFFFF"/>
+          </w:tcPr>
+          <w:p>
+            <w:r>
+              <w:rPr>
+                <w:sz w:val="20"/>
+              </w:rPr>
+              <w:t>Added S11 dialogue (Overnight, 22s)</w:t>
+            </w:r>
+          </w:p>
+        </w:tc>
+        <w:tc>
+          <w:tcPr>
+            <w:tcW w:type="dxa" w:w="5904"/>
+            <w:shd w:val="clear" w:color="auto" w:fill="FFFFFF"/>
+          </w:tcPr>
+          <w:p>
+            <w:r>
+              <w:rPr>
+                <w:sz w:val="20"/>
+              </w:rPr>
+              <w:t>fig10/fig11 added in v2 but unscripted</w:t>
+            </w:r>
+          </w:p>
+        </w:tc>
+      </w:tr>
+      <w:tr>
+        <w:tc>
+          <w:tcPr>
+            <w:tcW w:type="dxa" w:w="5904"/>
+            <w:shd w:val="clear" w:color="auto" w:fill="F2F2F7"/>
+          </w:tcPr>
+          <w:p>
+            <w:r>
+              <w:rPr>
+                <w:sz w:val="20"/>
+              </w:rPr>
+              <w:t>Added S12 dialogue (Staleness, 16s)</w:t>
+            </w:r>
+          </w:p>
+        </w:tc>
+        <w:tc>
+          <w:tcPr>
+            <w:tcW w:type="dxa" w:w="5904"/>
+            <w:shd w:val="clear" w:color="auto" w:fill="F2F2F7"/>
+          </w:tcPr>
+          <w:p>
+            <w:r>
+              <w:rPr>
+                <w:sz w:val="20"/>
+              </w:rPr>
+              <w:t>fig09 added in v2 but unscripted</w:t>
+            </w:r>
+          </w:p>
+        </w:tc>
+      </w:tr>
+      <w:tr>
+        <w:tc>
+          <w:tcPr>
+            <w:tcW w:type="dxa" w:w="5904"/>
+            <w:shd w:val="clear" w:color="auto" w:fill="FFFFFF"/>
+          </w:tcPr>
+          <w:p>
+            <w:r>
+              <w:rPr>
+                <w:sz w:val="20"/>
+              </w:rPr>
+              <w:t>Expanded S13 to include Impact framing</w:t>
+            </w:r>
+          </w:p>
+        </w:tc>
+        <w:tc>
+          <w:tcPr>
+            <w:tcW w:type="dxa" w:w="5904"/>
+            <w:shd w:val="clear" w:color="auto" w:fill="FFFFFF"/>
+          </w:tcPr>
+          <w:p>
+            <w:r>
+              <w:rPr>
+                <w:sz w:val="20"/>
+              </w:rPr>
+              <w:t>Replaced standalone Slide 8 from old script</w:t>
+            </w:r>
+          </w:p>
+        </w:tc>
+      </w:tr>
+      <w:tr>
+        <w:tc>
+          <w:tcPr>
+            <w:tcW w:type="dxa" w:w="5904"/>
+            <w:shd w:val="clear" w:color="auto" w:fill="F2F2F7"/>
+          </w:tcPr>
+          <w:p>
+            <w:r>
+              <w:rPr>
+                <w:sz w:val="20"/>
+              </w:rPr>
+              <w:t>Updated all timing markers</w:t>
+            </w:r>
+          </w:p>
+        </w:tc>
+        <w:tc>
+          <w:tcPr>
+            <w:tcW w:type="dxa" w:w="5904"/>
+            <w:shd w:val="clear" w:color="auto" w:fill="F2F2F7"/>
+          </w:tcPr>
+          <w:p>
+            <w:r>
+              <w:rPr>
+                <w:sz w:val="20"/>
+              </w:rPr>
+              <w:t>9→13 slides, same 8-minute target</w:t>
+            </w:r>
+          </w:p>
+        </w:tc>
+      </w:tr>
+      <w:tr>
+        <w:tc>
+          <w:tcPr>
+            <w:tcW w:type="dxa" w:w="5904"/>
+            <w:shd w:val="clear" w:color="auto" w:fill="FFFFFF"/>
+          </w:tcPr>
+          <w:p>
+            <w:r>
+              <w:rPr>
+                <w:sz w:val="20"/>
+              </w:rPr>
+              <w:t>Updated Visual Guide table</w:t>
+            </w:r>
+          </w:p>
+        </w:tc>
+        <w:tc>
+          <w:tcPr>
+            <w:tcW w:type="dxa" w:w="5904"/>
+            <w:shd w:val="clear" w:color="auto" w:fill="FFFFFF"/>
+          </w:tcPr>
+          <w:p>
+            <w:r>
+              <w:rPr>
+                <w:sz w:val="20"/>
+              </w:rPr>
+              <w:t>Now 13-row table matching v2 slide names</w:t>
+            </w:r>
+          </w:p>
+        </w:tc>
+      </w:tr>
+    </w:tbl>
+    <w:p/>
     <w:sectPr>
       <w:pgSz w:w="12240" w:h="15840"/>
       <w:pgMar w:top="1440" w:right="3168" w:bottom="1440" w:left="1440" w:header="720" w:footer="720" w:gutter="0"/>
@@ -14898,12 +15071,12 @@
     <w:name w:val="SlideHeader"/>
     <w:basedOn w:val="Normal"/>
     <w:pPr>
-      <w:keepNext/>
       <w:spacing w:before="360" w:after="80"/>
     </w:pPr>
     <w:rPr>
       <w:rFonts w:ascii="Arial" w:hAnsi="Arial"/>
       <w:b/>
+      <w:i w:val="0"/>
       <w:color w:val="CC0633"/>
       <w:sz w:val="32"/>
     </w:rPr>
@@ -14917,6 +15090,7 @@
     </w:pPr>
     <w:rPr>
       <w:rFonts w:ascii="Georgia" w:hAnsi="Georgia"/>
+      <w:b w:val="0"/>
       <w:i/>
       <w:color w:val="1A1A2E"/>
       <w:sz w:val="24"/>
@@ -14931,8 +15105,24 @@
     </w:pPr>
     <w:rPr>
       <w:rFonts w:ascii="Arial" w:hAnsi="Arial"/>
+      <w:b w:val="0"/>
       <w:i/>
-      <w:color w:val="555555"/>
+      <w:color w:val="888888"/>
+      <w:sz w:val="20"/>
+    </w:rPr>
+  </w:style>
+  <w:style w:type="paragraph" w:customStyle="1" w:styleId="PauseBeat">
+    <w:name w:val="PauseBeat"/>
+    <w:basedOn w:val="Normal"/>
+    <w:pPr>
+      <w:spacing w:before="40" w:after="40"/>
+      <w:ind w:left="432"/>
+    </w:pPr>
+    <w:rPr>
+      <w:rFonts w:ascii="Arial" w:hAnsi="Arial"/>
+      <w:b/>
+      <w:i w:val="0"/>
+      <w:color w:val="2277CC"/>
       <w:sz w:val="20"/>
     </w:rPr>
   </w:style>
@@ -14945,22 +15135,25 @@
     </w:pPr>
     <w:rPr>
       <w:rFonts w:ascii="Arial" w:hAnsi="Arial"/>
+      <w:b w:val="0"/>
+      <w:i w:val="0"/>
       <w:color w:val="6D4000"/>
       <w:sz w:val="20"/>
     </w:rPr>
   </w:style>
-  <w:style w:type="paragraph" w:customStyle="1" w:styleId="Pause">
-    <w:name w:val="Pause"/>
+  <w:style w:type="paragraph" w:customStyle="1" w:styleId="SlideCue">
+    <w:name w:val="SlideCue"/>
     <w:basedOn w:val="Normal"/>
     <w:pPr>
-      <w:spacing w:before="40" w:after="40"/>
+      <w:spacing w:before="40" w:after="80"/>
       <w:ind w:left="432"/>
     </w:pPr>
     <w:rPr>
-      <w:rFonts w:ascii="Arial" w:hAnsi="Arial"/>
-      <w:b/>
-      <w:color w:val="2277CC"/>
-      <w:sz w:val="20"/>
+      <w:rFonts w:ascii="Courier New" w:hAnsi="Courier New"/>
+      <w:b w:val="0"/>
+      <w:i w:val="0"/>
+      <w:color w:val="444444"/>
+      <w:sz w:val="18"/>
     </w:rPr>
   </w:style>
   <w:style w:type="paragraph" w:customStyle="1" w:styleId="QAHeader">
@@ -14972,33 +15165,37 @@
     <w:rPr>
       <w:rFonts w:ascii="Arial" w:hAnsi="Arial"/>
       <w:b/>
+      <w:i w:val="0"/>
       <w:color w:val="1B5E20"/>
       <w:sz w:val="26"/>
     </w:rPr>
   </w:style>
-  <w:style w:type="paragraph" w:customStyle="1" w:styleId="Oneliner">
-    <w:name w:val="Oneliner"/>
+  <w:style w:type="paragraph" w:customStyle="1" w:styleId="QAOpener">
+    <w:name w:val="QAOpener"/>
     <w:basedOn w:val="Normal"/>
     <w:pPr>
-      <w:spacing w:after="40"/>
+      <w:spacing w:before="40" w:after="40"/>
       <w:ind w:left="432"/>
     </w:pPr>
     <w:rPr>
       <w:rFonts w:ascii="Arial" w:hAnsi="Arial"/>
       <w:b/>
+      <w:i w:val="0"/>
       <w:color w:val="1B5E20"/>
       <w:sz w:val="20"/>
     </w:rPr>
   </w:style>
-  <w:style w:type="paragraph" w:customStyle="1" w:styleId="FullAnswer">
-    <w:name w:val="FullAnswer"/>
+  <w:style w:type="paragraph" w:customStyle="1" w:styleId="QABody">
+    <w:name w:val="QABody"/>
     <w:basedOn w:val="Normal"/>
     <w:pPr>
-      <w:spacing w:after="160"/>
+      <w:spacing w:before="40" w:after="160"/>
       <w:ind w:left="432"/>
     </w:pPr>
     <w:rPr>
       <w:rFonts w:ascii="Arial" w:hAnsi="Arial"/>
+      <w:b w:val="0"/>
+      <w:i w:val="0"/>
       <w:color w:val="1A1A2E"/>
       <w:sz w:val="22"/>
     </w:rPr>
@@ -15007,12 +15204,13 @@
     <w:name w:val="Note"/>
     <w:basedOn w:val="Normal"/>
     <w:pPr>
-      <w:spacing w:after="80"/>
+      <w:spacing w:before="80" w:after="80"/>
     </w:pPr>
     <w:rPr>
       <w:rFonts w:ascii="Arial" w:hAnsi="Arial"/>
+      <w:b w:val="0"/>
       <w:i/>
-      <w:color w:val="555555"/>
+      <w:color w:val="888888"/>
       <w:sz w:val="20"/>
     </w:rPr>
   </w:style>

</xml_diff>

<commit_message>
Improve script storytelling + add new visuals to poster
script.md:
  - S5: Baselines fail reframed — "we tried them all" narrative
  - S9: Added pivot sentence bridging to S10 ("was it finding good paths?")
  - S10: Rewritten with gesture cues and question-answer framing
  - S11: Rewritten — "now here is the real test" tension opener
  - S12: Rewritten — "last question" framing + "the playbook is simple" close
  - Timing table updated for revised slide durations

poster_filled_manual.pptx:
  + Added $33T market bar chart (right column, y≈3–7")
  + Added baselines fail chart (right column, y≈10–15")
  + Both charts generated at 220 DPI, poster-quality styling

patch_poster_v2.py:
  New patch script for the above two additions

Co-authored-by: Cursor <cursoragent@cursor.com>
</commit_message>
<xml_diff>
--- a/docs/latex/StablecoinArbitrage_GSS2026/presentation/script_for_review.docx
+++ b/docs/latex/StablecoinArbitrage_GSS2026/presentation/script_for_review.docx
@@ -480,7 +480,7 @@
         <w:rPr>
           <w:color w:val="1A1A2E"/>
         </w:rPr>
-        <w:t>SLIDE 9 · Key Result · 5:10 – 5:40</w:t>
+        <w:t>SLIDE 9 · Key Result · 5:10 – 5:45</w:t>
       </w:r>
     </w:p>
     <w:p>
@@ -499,7 +499,7 @@
         <w:rPr>
           <w:color w:val="1A1A2E"/>
         </w:rPr>
-        <w:t>SLIDE 10 · Profit Quality &amp; Speed · 5:40 – 6:00</w:t>
+        <w:t>SLIDE 10 · Profit Quality &amp; Speed · 5:45 – 6:05</w:t>
       </w:r>
     </w:p>
     <w:p>
@@ -518,7 +518,7 @@
         <w:rPr>
           <w:color w:val="1A1A2E"/>
         </w:rPr>
-        <w:t>SLIDE 11 · Overnight Campaign · 6:00 – 6:22</w:t>
+        <w:t>SLIDE 11 · Overnight Campaign · 6:05 – 6:25</w:t>
       </w:r>
     </w:p>
     <w:p>
@@ -537,7 +537,7 @@
         <w:rPr>
           <w:color w:val="1A1A2E"/>
         </w:rPr>
-        <w:t>SLIDE 12 · Execution Window · 6:22 – 6:38</w:t>
+        <w:t>SLIDE 12 · Execution Window · 6:25 – 6:40</w:t>
       </w:r>
     </w:p>
     <w:p>
@@ -2164,7 +2164,7 @@
               <w:rPr>
                 <w:sz w:val="20"/>
               </w:rPr>
-              <w:t>3:10</w:t>
+              <w:t>3:12</w:t>
             </w:r>
           </w:p>
         </w:tc>
@@ -2178,7 +2178,7 @@
               <w:rPr>
                 <w:sz w:val="20"/>
               </w:rPr>
-              <w:t>3:10</w:t>
+              <w:t>3:12</w:t>
             </w:r>
           </w:p>
         </w:tc>
@@ -2222,7 +2222,7 @@
               <w:rPr>
                 <w:sz w:val="20"/>
               </w:rPr>
-              <w:t>3:40</w:t>
+              <w:t>3:42</w:t>
             </w:r>
           </w:p>
         </w:tc>
@@ -2236,7 +2236,7 @@
               <w:rPr>
                 <w:sz w:val="20"/>
               </w:rPr>
-              <w:t>3:40</w:t>
+              <w:t>3:42</w:t>
             </w:r>
           </w:p>
         </w:tc>
@@ -2280,7 +2280,7 @@
               <w:rPr>
                 <w:sz w:val="20"/>
               </w:rPr>
-              <w:t>4:20</w:t>
+              <w:t>4:22</w:t>
             </w:r>
           </w:p>
         </w:tc>
@@ -2294,7 +2294,7 @@
               <w:rPr>
                 <w:sz w:val="20"/>
               </w:rPr>
-              <w:t>4:20</w:t>
+              <w:t>4:22</w:t>
             </w:r>
           </w:p>
         </w:tc>
@@ -2338,7 +2338,7 @@
               <w:rPr>
                 <w:sz w:val="20"/>
               </w:rPr>
-              <w:t>5:10</w:t>
+              <w:t>5:12</w:t>
             </w:r>
           </w:p>
         </w:tc>
@@ -2352,7 +2352,7 @@
               <w:rPr>
                 <w:sz w:val="20"/>
               </w:rPr>
-              <w:t>5:10</w:t>
+              <w:t>5:12</w:t>
             </w:r>
           </w:p>
         </w:tc>
@@ -2396,7 +2396,7 @@
               <w:rPr>
                 <w:sz w:val="20"/>
               </w:rPr>
-              <w:t>5:40</w:t>
+              <w:t>5:45</w:t>
             </w:r>
           </w:p>
         </w:tc>
@@ -2410,7 +2410,7 @@
               <w:rPr>
                 <w:sz w:val="20"/>
               </w:rPr>
-              <w:t>5:40</w:t>
+              <w:t>5:45</w:t>
             </w:r>
           </w:p>
         </w:tc>
@@ -2454,7 +2454,7 @@
               <w:rPr>
                 <w:sz w:val="20"/>
               </w:rPr>
-              <w:t>6:00</w:t>
+              <w:t>6:05</w:t>
             </w:r>
           </w:p>
         </w:tc>
@@ -2468,7 +2468,7 @@
               <w:rPr>
                 <w:sz w:val="20"/>
               </w:rPr>
-              <w:t>6:00</w:t>
+              <w:t>6:05</w:t>
             </w:r>
           </w:p>
         </w:tc>
@@ -2512,7 +2512,7 @@
               <w:rPr>
                 <w:sz w:val="20"/>
               </w:rPr>
-              <w:t>6:22</w:t>
+              <w:t>6:25</w:t>
             </w:r>
           </w:p>
         </w:tc>
@@ -2526,7 +2526,7 @@
               <w:rPr>
                 <w:sz w:val="20"/>
               </w:rPr>
-              <w:t>6:22</w:t>
+              <w:t>6:25</w:t>
             </w:r>
           </w:p>
         </w:tc>
@@ -2570,7 +2570,7 @@
               <w:rPr>
                 <w:sz w:val="20"/>
               </w:rPr>
-              <w:t>6:38</w:t>
+              <w:t>6:40</w:t>
             </w:r>
           </w:p>
         </w:tc>
@@ -2584,7 +2584,7 @@
               <w:rPr>
                 <w:sz w:val="20"/>
               </w:rPr>
-              <w:t>6:38</w:t>
+              <w:t>6:40</w:t>
             </w:r>
           </w:p>
         </w:tc>

</xml_diff>